<commit_message>
Arquivos corrigidos com documento .docx
Neste commit, corrigi alguns módulos para atender totalmente aos requisitos pedidos pela atividade prática parte 2.
</commit_message>
<xml_diff>
--- a/Atividade Prática 1.docx
+++ b/Atividade Prática 1.docx
@@ -532,7 +532,21 @@
         <w:rPr>
           <w:rFonts w:ascii="Times New Roman" w:hAnsi="Times New Roman" w:cs="Times New Roman"/>
         </w:rPr>
-        <w:t xml:space="preserve"> Main com</w:t>
+        <w:t xml:space="preserve"> </w:t>
+      </w:r>
+      <w:proofErr w:type="spellStart"/>
+      <w:r>
+        <w:rPr>
+          <w:rFonts w:ascii="Times New Roman" w:hAnsi="Times New Roman" w:cs="Times New Roman"/>
+        </w:rPr>
+        <w:t>Main</w:t>
+      </w:r>
+      <w:proofErr w:type="spellEnd"/>
+      <w:r>
+        <w:rPr>
+          <w:rFonts w:ascii="Times New Roman" w:hAnsi="Times New Roman" w:cs="Times New Roman"/>
+        </w:rPr>
+        <w:t xml:space="preserve"> com</w:t>
       </w:r>
       <w:r>
         <w:rPr>
@@ -1139,7 +1153,21 @@
         <w:rPr>
           <w:rFonts w:ascii="Times New Roman" w:hAnsi="Times New Roman" w:cs="Times New Roman"/>
         </w:rPr>
-        <w:t xml:space="preserve"> Main com testes e objetos criados</w:t>
+        <w:t xml:space="preserve"> </w:t>
+      </w:r>
+      <w:proofErr w:type="spellStart"/>
+      <w:r>
+        <w:rPr>
+          <w:rFonts w:ascii="Times New Roman" w:hAnsi="Times New Roman" w:cs="Times New Roman"/>
+        </w:rPr>
+        <w:t>Main</w:t>
+      </w:r>
+      <w:proofErr w:type="spellEnd"/>
+      <w:r>
+        <w:rPr>
+          <w:rFonts w:ascii="Times New Roman" w:hAnsi="Times New Roman" w:cs="Times New Roman"/>
+        </w:rPr>
+        <w:t xml:space="preserve"> com testes e objetos criados</w:t>
       </w:r>
     </w:p>
     <w:p>
@@ -1411,15 +1439,7 @@
           <w:bCs/>
         </w:rPr>
         <w:lastRenderedPageBreak/>
-        <w:t xml:space="preserve">Exercício </w:t>
-      </w:r>
-      <w:r>
-        <w:rPr>
-          <w:rFonts w:ascii="Times New Roman" w:hAnsi="Times New Roman" w:cs="Times New Roman"/>
-          <w:b/>
-          <w:bCs/>
-        </w:rPr>
-        <w:t>3</w:t>
+        <w:t>Exercício 3</w:t>
       </w:r>
     </w:p>
     <w:p>
@@ -1998,7 +2018,21 @@
         <w:rPr>
           <w:rFonts w:ascii="Times New Roman" w:hAnsi="Times New Roman" w:cs="Times New Roman"/>
         </w:rPr>
-        <w:t xml:space="preserve"> Main com objetos criados e testes feitos</w:t>
+        <w:t xml:space="preserve"> </w:t>
+      </w:r>
+      <w:proofErr w:type="spellStart"/>
+      <w:r>
+        <w:rPr>
+          <w:rFonts w:ascii="Times New Roman" w:hAnsi="Times New Roman" w:cs="Times New Roman"/>
+        </w:rPr>
+        <w:t>Main</w:t>
+      </w:r>
+      <w:proofErr w:type="spellEnd"/>
+      <w:r>
+        <w:rPr>
+          <w:rFonts w:ascii="Times New Roman" w:hAnsi="Times New Roman" w:cs="Times New Roman"/>
+        </w:rPr>
+        <w:t xml:space="preserve"> com objetos criados e testes feitos</w:t>
       </w:r>
     </w:p>
     <w:p>
@@ -2231,14 +2265,27 @@
       <w:r>
         <w:t xml:space="preserve">Figura </w:t>
       </w:r>
-      <w:fldSimple w:instr=" SEQ Figura \* ARABIC ">
-        <w:r>
-          <w:rPr>
-            <w:noProof/>
-          </w:rPr>
-          <w:t>13</w:t>
-        </w:r>
-      </w:fldSimple>
+      <w:r>
+        <w:fldChar w:fldCharType="begin"/>
+      </w:r>
+      <w:r>
+        <w:instrText xml:space="preserve"> SEQ Figura \* ARABIC </w:instrText>
+      </w:r>
+      <w:r>
+        <w:fldChar w:fldCharType="separate"/>
+      </w:r>
+      <w:r>
+        <w:rPr>
+          <w:noProof/>
+        </w:rPr>
+        <w:t>13</w:t>
+      </w:r>
+      <w:r>
+        <w:rPr>
+          <w:noProof/>
+        </w:rPr>
+        <w:fldChar w:fldCharType="end"/>
+      </w:r>
       <w:r>
         <w:t xml:space="preserve"> Diagrama UML</w:t>
       </w:r>
@@ -2359,14 +2406,27 @@
       <w:r>
         <w:t xml:space="preserve">Figura </w:t>
       </w:r>
-      <w:fldSimple w:instr=" SEQ Figura \* ARABIC ">
-        <w:r>
-          <w:rPr>
-            <w:noProof/>
-          </w:rPr>
-          <w:t>14</w:t>
-        </w:r>
-      </w:fldSimple>
+      <w:r>
+        <w:fldChar w:fldCharType="begin"/>
+      </w:r>
+      <w:r>
+        <w:instrText xml:space="preserve"> SEQ Figura \* ARABIC </w:instrText>
+      </w:r>
+      <w:r>
+        <w:fldChar w:fldCharType="separate"/>
+      </w:r>
+      <w:r>
+        <w:rPr>
+          <w:noProof/>
+        </w:rPr>
+        <w:t>14</w:t>
+      </w:r>
+      <w:r>
+        <w:rPr>
+          <w:noProof/>
+        </w:rPr>
+        <w:fldChar w:fldCharType="end"/>
+      </w:r>
       <w:r>
         <w:t xml:space="preserve"> </w:t>
       </w:r>
@@ -2485,14 +2545,27 @@
       <w:r>
         <w:t xml:space="preserve">Figura </w:t>
       </w:r>
-      <w:fldSimple w:instr=" SEQ Figura \* ARABIC ">
-        <w:r>
-          <w:rPr>
-            <w:noProof/>
-          </w:rPr>
-          <w:t>15</w:t>
-        </w:r>
-      </w:fldSimple>
+      <w:r>
+        <w:fldChar w:fldCharType="begin"/>
+      </w:r>
+      <w:r>
+        <w:instrText xml:space="preserve"> SEQ Figura \* ARABIC </w:instrText>
+      </w:r>
+      <w:r>
+        <w:fldChar w:fldCharType="separate"/>
+      </w:r>
+      <w:r>
+        <w:rPr>
+          <w:noProof/>
+        </w:rPr>
+        <w:t>15</w:t>
+      </w:r>
+      <w:r>
+        <w:rPr>
+          <w:noProof/>
+        </w:rPr>
+        <w:fldChar w:fldCharType="end"/>
+      </w:r>
       <w:r>
         <w:t xml:space="preserve"> </w:t>
       </w:r>
@@ -2571,19 +2644,37 @@
       <w:r>
         <w:t xml:space="preserve">Figura </w:t>
       </w:r>
-      <w:fldSimple w:instr=" SEQ Figura \* ARABIC ">
-        <w:r>
-          <w:rPr>
-            <w:noProof/>
-          </w:rPr>
-          <w:t>16</w:t>
-        </w:r>
-      </w:fldSimple>
+      <w:r>
+        <w:fldChar w:fldCharType="begin"/>
+      </w:r>
+      <w:r>
+        <w:instrText xml:space="preserve"> SEQ Figura \* ARABIC </w:instrText>
+      </w:r>
+      <w:r>
+        <w:fldChar w:fldCharType="separate"/>
+      </w:r>
+      <w:r>
+        <w:rPr>
+          <w:noProof/>
+        </w:rPr>
+        <w:t>16</w:t>
+      </w:r>
+      <w:r>
+        <w:rPr>
+          <w:noProof/>
+        </w:rPr>
+        <w:fldChar w:fldCharType="end"/>
+      </w:r>
       <w:r>
         <w:t xml:space="preserve"> </w:t>
       </w:r>
-      <w:r>
-        <w:t>Main com objetos criados e testes feitos</w:t>
+      <w:proofErr w:type="spellStart"/>
+      <w:r>
+        <w:t>Main</w:t>
+      </w:r>
+      <w:proofErr w:type="spellEnd"/>
+      <w:r>
+        <w:t xml:space="preserve"> com objetos criados e testes feitos</w:t>
       </w:r>
     </w:p>
     <w:p>
@@ -2715,14 +2806,27 @@
       <w:r>
         <w:t xml:space="preserve">Figura </w:t>
       </w:r>
-      <w:fldSimple w:instr=" SEQ Figura \* ARABIC ">
-        <w:r>
-          <w:rPr>
-            <w:noProof/>
-          </w:rPr>
-          <w:t>17</w:t>
-        </w:r>
-      </w:fldSimple>
+      <w:r>
+        <w:fldChar w:fldCharType="begin"/>
+      </w:r>
+      <w:r>
+        <w:instrText xml:space="preserve"> SEQ Figura \* ARABIC </w:instrText>
+      </w:r>
+      <w:r>
+        <w:fldChar w:fldCharType="separate"/>
+      </w:r>
+      <w:r>
+        <w:rPr>
+          <w:noProof/>
+        </w:rPr>
+        <w:t>17</w:t>
+      </w:r>
+      <w:r>
+        <w:rPr>
+          <w:noProof/>
+        </w:rPr>
+        <w:fldChar w:fldCharType="end"/>
+      </w:r>
       <w:r>
         <w:t xml:space="preserve"> Saída no terminal</w:t>
       </w:r>
@@ -2953,23 +3057,7 @@
           <w:bCs/>
         </w:rPr>
         <w:lastRenderedPageBreak/>
-        <w:t xml:space="preserve">Atividade Prática 1 – parte </w:t>
-      </w:r>
-      <w:r>
-        <w:rPr>
-          <w:rFonts w:ascii="Times New Roman" w:hAnsi="Times New Roman" w:cs="Times New Roman"/>
-          <w:b/>
-          <w:bCs/>
-        </w:rPr>
-        <w:t>2</w:t>
-      </w:r>
-      <w:r>
-        <w:rPr>
-          <w:rFonts w:ascii="Times New Roman" w:hAnsi="Times New Roman" w:cs="Times New Roman"/>
-          <w:b/>
-          <w:bCs/>
-        </w:rPr>
-        <w:t xml:space="preserve"> – APPOO</w:t>
+        <w:t>Atividade Prática 1 – parte 2 – APPOO</w:t>
       </w:r>
     </w:p>
     <w:p>
@@ -3365,6 +3453,7 @@
       <w:r>
         <w:rPr>
           <w:rFonts w:ascii="Times New Roman" w:hAnsi="Times New Roman" w:cs="Times New Roman"/>
+          <w:noProof/>
         </w:rPr>
         <w:drawing>
           <wp:inline distT="0" distB="0" distL="0" distR="0" wp14:anchorId="2981F0DF" wp14:editId="79026B1B">
@@ -3486,6 +3575,7 @@
       <w:r>
         <w:rPr>
           <w:rFonts w:ascii="Times New Roman" w:hAnsi="Times New Roman" w:cs="Times New Roman"/>
+          <w:noProof/>
         </w:rPr>
         <w:drawing>
           <wp:inline distT="0" distB="0" distL="0" distR="0" wp14:anchorId="27D8157C" wp14:editId="40E57676">
@@ -3602,6 +3692,7 @@
       <w:r>
         <w:rPr>
           <w:rFonts w:ascii="Times New Roman" w:hAnsi="Times New Roman" w:cs="Times New Roman"/>
+          <w:noProof/>
         </w:rPr>
         <w:drawing>
           <wp:inline distT="0" distB="0" distL="0" distR="0" wp14:anchorId="7C0B5673" wp14:editId="323776EA">
@@ -3718,6 +3809,7 @@
       <w:r>
         <w:rPr>
           <w:rFonts w:ascii="Times New Roman" w:hAnsi="Times New Roman" w:cs="Times New Roman"/>
+          <w:noProof/>
         </w:rPr>
         <w:drawing>
           <wp:inline distT="0" distB="0" distL="0" distR="0" wp14:anchorId="51EA7573" wp14:editId="76771CB8">
@@ -3826,6 +3918,7 @@
       <w:r>
         <w:rPr>
           <w:rFonts w:ascii="Times New Roman" w:hAnsi="Times New Roman" w:cs="Times New Roman"/>
+          <w:noProof/>
         </w:rPr>
         <w:lastRenderedPageBreak/>
         <w:drawing>
@@ -3943,6 +4036,7 @@
       <w:r>
         <w:rPr>
           <w:rFonts w:ascii="Times New Roman" w:hAnsi="Times New Roman" w:cs="Times New Roman"/>
+          <w:noProof/>
         </w:rPr>
         <w:drawing>
           <wp:inline distT="0" distB="0" distL="0" distR="0" wp14:anchorId="25F3C09A" wp14:editId="2EAA8DBE">
@@ -4263,6 +4357,371 @@
         </w:rPr>
         <w:lastRenderedPageBreak/>
         <w:t>Exercício 2</w:t>
+      </w:r>
+    </w:p>
+    <w:p>
+      <w:pPr>
+        <w:rPr>
+          <w:rFonts w:ascii="Times New Roman" w:hAnsi="Times New Roman" w:cs="Times New Roman"/>
+          <w:color w:val="FF0000"/>
+        </w:rPr>
+      </w:pPr>
+      <w:r>
+        <w:rPr>
+          <w:rFonts w:ascii="Times New Roman" w:hAnsi="Times New Roman" w:cs="Times New Roman"/>
+          <w:color w:val="FF0000"/>
+        </w:rPr>
+        <w:t xml:space="preserve">A diferença é que enquanto na herança simples, cada classe terá apenas uma subclasse, </w:t>
+      </w:r>
+      <w:r>
+        <w:rPr>
+          <w:rFonts w:ascii="Times New Roman" w:hAnsi="Times New Roman" w:cs="Times New Roman"/>
+          <w:color w:val="FF0000"/>
+        </w:rPr>
+        <w:t>na herança múltipla</w:t>
+      </w:r>
+    </w:p>
+    <w:p>
+      <w:pPr>
+        <w:jc w:val="center"/>
+        <w:rPr>
+          <w:rFonts w:ascii="Times New Roman" w:hAnsi="Times New Roman" w:cs="Times New Roman"/>
+          <w:b/>
+          <w:bCs/>
+        </w:rPr>
+      </w:pPr>
+    </w:p>
+    <w:p>
+      <w:pPr>
+        <w:jc w:val="center"/>
+        <w:rPr>
+          <w:rFonts w:ascii="Times New Roman" w:hAnsi="Times New Roman" w:cs="Times New Roman"/>
+          <w:b/>
+          <w:bCs/>
+        </w:rPr>
+      </w:pPr>
+      <w:r>
+        <w:rPr>
+          <w:rFonts w:ascii="Times New Roman" w:hAnsi="Times New Roman" w:cs="Times New Roman"/>
+          <w:b/>
+          <w:bCs/>
+        </w:rPr>
+        <w:t xml:space="preserve">Exercício </w:t>
+      </w:r>
+      <w:r>
+        <w:rPr>
+          <w:rFonts w:ascii="Times New Roman" w:hAnsi="Times New Roman" w:cs="Times New Roman"/>
+          <w:b/>
+          <w:bCs/>
+        </w:rPr>
+        <w:t>3</w:t>
+      </w:r>
+    </w:p>
+    <w:p>
+      <w:pPr>
+        <w:jc w:val="center"/>
+        <w:rPr>
+          <w:rFonts w:ascii="Times New Roman" w:hAnsi="Times New Roman" w:cs="Times New Roman"/>
+          <w:b/>
+          <w:bCs/>
+        </w:rPr>
+      </w:pPr>
+    </w:p>
+    <w:p>
+      <w:pPr>
+        <w:keepNext/>
+        <w:jc w:val="center"/>
+      </w:pPr>
+      <w:r>
+        <w:rPr>
+          <w:rFonts w:ascii="Times New Roman" w:hAnsi="Times New Roman" w:cs="Times New Roman"/>
+          <w:b/>
+          <w:bCs/>
+          <w:noProof/>
+        </w:rPr>
+        <w:drawing>
+          <wp:inline distT="0" distB="0" distL="0" distR="0" wp14:anchorId="79A7E037" wp14:editId="303AF5D6">
+            <wp:extent cx="5391150" cy="6162675"/>
+            <wp:effectExtent l="0" t="0" r="0" b="9525"/>
+            <wp:docPr id="5" name="Imagem 5"/>
+            <wp:cNvGraphicFramePr>
+              <a:graphicFrameLocks xmlns:a="http://schemas.openxmlformats.org/drawingml/2006/main" noChangeAspect="1"/>
+            </wp:cNvGraphicFramePr>
+            <a:graphic xmlns:a="http://schemas.openxmlformats.org/drawingml/2006/main">
+              <a:graphicData uri="http://schemas.openxmlformats.org/drawingml/2006/picture">
+                <pic:pic xmlns:pic="http://schemas.openxmlformats.org/drawingml/2006/picture">
+                  <pic:nvPicPr>
+                    <pic:cNvPr id="0" name="Picture 1"/>
+                    <pic:cNvPicPr>
+                      <a:picLocks noChangeAspect="1" noChangeArrowheads="1"/>
+                    </pic:cNvPicPr>
+                  </pic:nvPicPr>
+                  <pic:blipFill>
+                    <a:blip r:embed="rId32">
+                      <a:extLst>
+                        <a:ext uri="{28A0092B-C50C-407E-A947-70E740481C1C}">
+                          <a14:useLocalDpi xmlns:a14="http://schemas.microsoft.com/office/drawing/2010/main" val="0"/>
+                        </a:ext>
+                      </a:extLst>
+                    </a:blip>
+                    <a:srcRect/>
+                    <a:stretch>
+                      <a:fillRect/>
+                    </a:stretch>
+                  </pic:blipFill>
+                  <pic:spPr bwMode="auto">
+                    <a:xfrm>
+                      <a:off x="0" y="0"/>
+                      <a:ext cx="5391150" cy="6162675"/>
+                    </a:xfrm>
+                    <a:prstGeom prst="rect">
+                      <a:avLst/>
+                    </a:prstGeom>
+                    <a:noFill/>
+                    <a:ln>
+                      <a:noFill/>
+                    </a:ln>
+                  </pic:spPr>
+                </pic:pic>
+              </a:graphicData>
+            </a:graphic>
+          </wp:inline>
+        </w:drawing>
+      </w:r>
+    </w:p>
+    <w:p>
+      <w:pPr>
+        <w:pStyle w:val="Legenda"/>
+        <w:jc w:val="center"/>
+      </w:pPr>
+      <w:r>
+        <w:t xml:space="preserve">Figura </w:t>
+      </w:r>
+      <w:fldSimple w:instr=" SEQ Figura \* ARABIC ">
+        <w:r>
+          <w:rPr>
+            <w:noProof/>
+          </w:rPr>
+          <w:t>28</w:t>
+        </w:r>
+      </w:fldSimple>
+      <w:r>
+        <w:t xml:space="preserve"> Módulo principal</w:t>
+      </w:r>
+    </w:p>
+    <w:p/>
+    <w:p>
+      <w:pPr>
+        <w:keepNext/>
+        <w:jc w:val="center"/>
+      </w:pPr>
+      <w:r>
+        <w:lastRenderedPageBreak/>
+        <w:drawing>
+          <wp:inline distT="0" distB="0" distL="0" distR="0" wp14:anchorId="0A369572" wp14:editId="7BD1A661">
+            <wp:extent cx="5400040" cy="2251710"/>
+            <wp:effectExtent l="0" t="0" r="0" b="0"/>
+            <wp:docPr id="10" name="Imagem 10"/>
+            <wp:cNvGraphicFramePr>
+              <a:graphicFrameLocks xmlns:a="http://schemas.openxmlformats.org/drawingml/2006/main" noChangeAspect="1"/>
+            </wp:cNvGraphicFramePr>
+            <a:graphic xmlns:a="http://schemas.openxmlformats.org/drawingml/2006/main">
+              <a:graphicData uri="http://schemas.openxmlformats.org/drawingml/2006/picture">
+                <pic:pic xmlns:pic="http://schemas.openxmlformats.org/drawingml/2006/picture">
+                  <pic:nvPicPr>
+                    <pic:cNvPr id="1" name=""/>
+                    <pic:cNvPicPr/>
+                  </pic:nvPicPr>
+                  <pic:blipFill>
+                    <a:blip r:embed="rId33"/>
+                    <a:stretch>
+                      <a:fillRect/>
+                    </a:stretch>
+                  </pic:blipFill>
+                  <pic:spPr>
+                    <a:xfrm>
+                      <a:off x="0" y="0"/>
+                      <a:ext cx="5400040" cy="2251710"/>
+                    </a:xfrm>
+                    <a:prstGeom prst="rect">
+                      <a:avLst/>
+                    </a:prstGeom>
+                  </pic:spPr>
+                </pic:pic>
+              </a:graphicData>
+            </a:graphic>
+          </wp:inline>
+        </w:drawing>
+      </w:r>
+    </w:p>
+    <w:p>
+      <w:pPr>
+        <w:pStyle w:val="Legenda"/>
+        <w:jc w:val="center"/>
+      </w:pPr>
+      <w:r>
+        <w:t xml:space="preserve">Figura </w:t>
+      </w:r>
+      <w:fldSimple w:instr=" SEQ Figura \* ARABIC ">
+        <w:r>
+          <w:rPr>
+            <w:noProof/>
+          </w:rPr>
+          <w:t>29</w:t>
+        </w:r>
+      </w:fldSimple>
+      <w:r>
+        <w:t xml:space="preserve"> </w:t>
+      </w:r>
+      <w:proofErr w:type="spellStart"/>
+      <w:r>
+        <w:t>Main</w:t>
+      </w:r>
+      <w:proofErr w:type="spellEnd"/>
+    </w:p>
+    <w:p/>
+    <w:p>
+      <w:pPr>
+        <w:keepNext/>
+      </w:pPr>
+      <w:r>
+        <w:drawing>
+          <wp:inline distT="0" distB="0" distL="0" distR="0" wp14:anchorId="37C04290" wp14:editId="51EF5A47">
+            <wp:extent cx="5400040" cy="1602105"/>
+            <wp:effectExtent l="0" t="0" r="0" b="0"/>
+            <wp:docPr id="28" name="Imagem 28"/>
+            <wp:cNvGraphicFramePr>
+              <a:graphicFrameLocks xmlns:a="http://schemas.openxmlformats.org/drawingml/2006/main" noChangeAspect="1"/>
+            </wp:cNvGraphicFramePr>
+            <a:graphic xmlns:a="http://schemas.openxmlformats.org/drawingml/2006/main">
+              <a:graphicData uri="http://schemas.openxmlformats.org/drawingml/2006/picture">
+                <pic:pic xmlns:pic="http://schemas.openxmlformats.org/drawingml/2006/picture">
+                  <pic:nvPicPr>
+                    <pic:cNvPr id="1" name=""/>
+                    <pic:cNvPicPr/>
+                  </pic:nvPicPr>
+                  <pic:blipFill>
+                    <a:blip r:embed="rId34"/>
+                    <a:stretch>
+                      <a:fillRect/>
+                    </a:stretch>
+                  </pic:blipFill>
+                  <pic:spPr>
+                    <a:xfrm>
+                      <a:off x="0" y="0"/>
+                      <a:ext cx="5400040" cy="1602105"/>
+                    </a:xfrm>
+                    <a:prstGeom prst="rect">
+                      <a:avLst/>
+                    </a:prstGeom>
+                  </pic:spPr>
+                </pic:pic>
+              </a:graphicData>
+            </a:graphic>
+          </wp:inline>
+        </w:drawing>
+      </w:r>
+    </w:p>
+    <w:p>
+      <w:pPr>
+        <w:pStyle w:val="Legenda"/>
+        <w:jc w:val="center"/>
+      </w:pPr>
+      <w:r>
+        <w:t xml:space="preserve">Figura </w:t>
+      </w:r>
+      <w:fldSimple w:instr=" SEQ Figura \* ARABIC ">
+        <w:r>
+          <w:rPr>
+            <w:noProof/>
+          </w:rPr>
+          <w:t>30</w:t>
+        </w:r>
+      </w:fldSimple>
+      <w:r>
+        <w:t xml:space="preserve"> Saída no terminal</w:t>
+      </w:r>
+    </w:p>
+    <w:p/>
+    <w:p/>
+    <w:p/>
+    <w:p>
+      <w:pPr>
+        <w:keepNext/>
+        <w:jc w:val="center"/>
+      </w:pPr>
+      <w:r>
+        <w:rPr>
+          <w:noProof/>
+        </w:rPr>
+        <w:drawing>
+          <wp:inline distT="0" distB="0" distL="0" distR="0" wp14:anchorId="349FEA16" wp14:editId="6F67B69B">
+            <wp:extent cx="4895850" cy="2339610"/>
+            <wp:effectExtent l="0" t="0" r="0" b="3810"/>
+            <wp:docPr id="33" name="Imagem 33"/>
+            <wp:cNvGraphicFramePr>
+              <a:graphicFrameLocks xmlns:a="http://schemas.openxmlformats.org/drawingml/2006/main" noChangeAspect="1"/>
+            </wp:cNvGraphicFramePr>
+            <a:graphic xmlns:a="http://schemas.openxmlformats.org/drawingml/2006/main">
+              <a:graphicData uri="http://schemas.openxmlformats.org/drawingml/2006/picture">
+                <pic:pic xmlns:pic="http://schemas.openxmlformats.org/drawingml/2006/picture">
+                  <pic:nvPicPr>
+                    <pic:cNvPr id="0" name="Picture 2"/>
+                    <pic:cNvPicPr>
+                      <a:picLocks noChangeAspect="1" noChangeArrowheads="1"/>
+                    </pic:cNvPicPr>
+                  </pic:nvPicPr>
+                  <pic:blipFill>
+                    <a:blip r:embed="rId35" cstate="print">
+                      <a:extLst>
+                        <a:ext uri="{28A0092B-C50C-407E-A947-70E740481C1C}">
+                          <a14:useLocalDpi xmlns:a14="http://schemas.microsoft.com/office/drawing/2010/main" val="0"/>
+                        </a:ext>
+                      </a:extLst>
+                    </a:blip>
+                    <a:srcRect/>
+                    <a:stretch>
+                      <a:fillRect/>
+                    </a:stretch>
+                  </pic:blipFill>
+                  <pic:spPr bwMode="auto">
+                    <a:xfrm>
+                      <a:off x="0" y="0"/>
+                      <a:ext cx="4902375" cy="2342728"/>
+                    </a:xfrm>
+                    <a:prstGeom prst="rect">
+                      <a:avLst/>
+                    </a:prstGeom>
+                    <a:noFill/>
+                    <a:ln>
+                      <a:noFill/>
+                    </a:ln>
+                  </pic:spPr>
+                </pic:pic>
+              </a:graphicData>
+            </a:graphic>
+          </wp:inline>
+        </w:drawing>
+      </w:r>
+    </w:p>
+    <w:p>
+      <w:pPr>
+        <w:pStyle w:val="Legenda"/>
+        <w:jc w:val="center"/>
+      </w:pPr>
+      <w:r>
+        <w:t xml:space="preserve">Figura </w:t>
+      </w:r>
+      <w:fldSimple w:instr=" SEQ Figura \* ARABIC ">
+        <w:r>
+          <w:rPr>
+            <w:noProof/>
+          </w:rPr>
+          <w:t>31</w:t>
+        </w:r>
+      </w:fldSimple>
+      <w:r>
+        <w:t xml:space="preserve"> Diagrama UML</w:t>
       </w:r>
     </w:p>
     <w:sectPr>

</xml_diff>

<commit_message>
Atividade prática parte 1 finalizada
Neste commit, envio a atividade prática 1 completa. Há todos os arquivos e documentações necessárias.
</commit_message>
<xml_diff>
--- a/Atividade Prática 1.docx
+++ b/Atividade Prática 1.docx
@@ -20,6 +20,54 @@
           <w:bCs/>
         </w:rPr>
         <w:t>Atividade Prática 1 – parte 1 – APPOO</w:t>
+      </w:r>
+    </w:p>
+    <w:p>
+      <w:pPr>
+        <w:jc w:val="both"/>
+        <w:rPr>
+          <w:rFonts w:ascii="Times New Roman" w:hAnsi="Times New Roman" w:cs="Times New Roman"/>
+          <w:b/>
+          <w:bCs/>
+        </w:rPr>
+      </w:pPr>
+      <w:r>
+        <w:rPr>
+          <w:rFonts w:ascii="Times New Roman" w:hAnsi="Times New Roman" w:cs="Times New Roman"/>
+          <w:b/>
+          <w:bCs/>
+        </w:rPr>
+        <w:t xml:space="preserve">Nome: </w:t>
+      </w:r>
+      <w:r>
+        <w:rPr>
+          <w:rFonts w:ascii="Times New Roman" w:hAnsi="Times New Roman" w:cs="Times New Roman"/>
+        </w:rPr>
+        <w:t>Guilherme Augusto Nunes</w:t>
+      </w:r>
+    </w:p>
+    <w:p>
+      <w:pPr>
+        <w:jc w:val="both"/>
+        <w:rPr>
+          <w:rFonts w:ascii="Times New Roman" w:hAnsi="Times New Roman" w:cs="Times New Roman"/>
+          <w:b/>
+          <w:bCs/>
+        </w:rPr>
+      </w:pPr>
+      <w:r>
+        <w:rPr>
+          <w:rFonts w:ascii="Times New Roman" w:hAnsi="Times New Roman" w:cs="Times New Roman"/>
+          <w:b/>
+          <w:bCs/>
+        </w:rPr>
+        <w:t xml:space="preserve">Matrícula: </w:t>
+      </w:r>
+      <w:r>
+        <w:rPr>
+          <w:rFonts w:ascii="Times New Roman" w:hAnsi="Times New Roman" w:cs="Times New Roman"/>
+        </w:rPr>
+        <w:t>2024017015</w:t>
       </w:r>
     </w:p>
     <w:p>
@@ -380,7 +428,7 @@
         <w:rPr>
           <w:rFonts w:ascii="Times New Roman" w:hAnsi="Times New Roman" w:cs="Times New Roman"/>
         </w:rPr>
-        <w:t xml:space="preserve"> Módulo principal com classe Bolo</w:t>
+        <w:t xml:space="preserve"> Módulo com classe Bolo</w:t>
       </w:r>
     </w:p>
     <w:p>
@@ -412,13 +460,7 @@
         <w:rPr>
           <w:rFonts w:ascii="Times New Roman" w:hAnsi="Times New Roman" w:cs="Times New Roman"/>
         </w:rPr>
-        <w:t xml:space="preserve"> o valor do atributo cobertura do objeto Bolo1 agora ele passa a não ter mais </w:t>
-      </w:r>
-      <w:r>
-        <w:rPr>
-          <w:rFonts w:ascii="Times New Roman" w:hAnsi="Times New Roman" w:cs="Times New Roman"/>
-        </w:rPr>
-        <w:t xml:space="preserve">cobertura </w:t>
+        <w:t xml:space="preserve"> o valor do atributo cobertura do objeto Bolo1 agora ele passa a não ter mais cobertura </w:t>
       </w:r>
       <w:r>
         <w:rPr>
@@ -998,7 +1040,7 @@
         <w:rPr>
           <w:rFonts w:ascii="Times New Roman" w:hAnsi="Times New Roman" w:cs="Times New Roman"/>
         </w:rPr>
-        <w:t xml:space="preserve"> Módulo principal com class</w:t>
+        <w:t xml:space="preserve"> Módulo com class</w:t>
       </w:r>
       <w:r>
         <w:rPr>
@@ -1012,11 +1054,19 @@
         </w:rPr>
         <w:t xml:space="preserve"> </w:t>
       </w:r>
-      <w:r>
-        <w:rPr>
-          <w:rFonts w:ascii="Times New Roman" w:hAnsi="Times New Roman" w:cs="Times New Roman"/>
-        </w:rPr>
-        <w:t>FazBolo, instância e método assar</w:t>
+      <w:proofErr w:type="spellStart"/>
+      <w:r>
+        <w:rPr>
+          <w:rFonts w:ascii="Times New Roman" w:hAnsi="Times New Roman" w:cs="Times New Roman"/>
+        </w:rPr>
+        <w:t>FazBolo</w:t>
+      </w:r>
+      <w:proofErr w:type="spellEnd"/>
+      <w:r>
+        <w:rPr>
+          <w:rFonts w:ascii="Times New Roman" w:hAnsi="Times New Roman" w:cs="Times New Roman"/>
+        </w:rPr>
+        <w:t>, instância e método assar</w:t>
       </w:r>
     </w:p>
     <w:p>
@@ -1578,7 +1628,7 @@
         <w:rPr>
           <w:rFonts w:ascii="Times New Roman" w:hAnsi="Times New Roman" w:cs="Times New Roman"/>
         </w:rPr>
-        <w:t xml:space="preserve"> Módulo principal com classes, instâncias e métodos</w:t>
+        <w:t xml:space="preserve"> Módulo com classes, instâncias e métodos</w:t>
       </w:r>
     </w:p>
     <w:p>
@@ -2095,6 +2145,9 @@
       <w:pPr>
         <w:keepNext/>
         <w:jc w:val="center"/>
+        <w:rPr>
+          <w:rFonts w:ascii="Times New Roman" w:hAnsi="Times New Roman" w:cs="Times New Roman"/>
+        </w:rPr>
       </w:pPr>
       <w:r>
         <w:rPr>
@@ -2194,6 +2247,7 @@
       <w:pPr>
         <w:jc w:val="center"/>
         <w:rPr>
+          <w:rFonts w:ascii="Times New Roman" w:hAnsi="Times New Roman" w:cs="Times New Roman"/>
           <w:noProof/>
         </w:rPr>
       </w:pPr>
@@ -2202,9 +2256,13 @@
       <w:pPr>
         <w:keepNext/>
         <w:jc w:val="center"/>
-      </w:pPr>
-      <w:r>
-        <w:rPr>
+        <w:rPr>
+          <w:rFonts w:ascii="Times New Roman" w:hAnsi="Times New Roman" w:cs="Times New Roman"/>
+        </w:rPr>
+      </w:pPr>
+      <w:r>
+        <w:rPr>
+          <w:rFonts w:ascii="Times New Roman" w:hAnsi="Times New Roman" w:cs="Times New Roman"/>
           <w:noProof/>
         </w:rPr>
         <w:drawing>
@@ -2261,32 +2319,52 @@
       <w:pPr>
         <w:pStyle w:val="Legenda"/>
         <w:jc w:val="center"/>
-      </w:pPr>
-      <w:r>
+        <w:rPr>
+          <w:rFonts w:ascii="Times New Roman" w:hAnsi="Times New Roman" w:cs="Times New Roman"/>
+        </w:rPr>
+      </w:pPr>
+      <w:r>
+        <w:rPr>
+          <w:rFonts w:ascii="Times New Roman" w:hAnsi="Times New Roman" w:cs="Times New Roman"/>
+        </w:rPr>
         <w:t xml:space="preserve">Figura </w:t>
       </w:r>
       <w:r>
+        <w:rPr>
+          <w:rFonts w:ascii="Times New Roman" w:hAnsi="Times New Roman" w:cs="Times New Roman"/>
+        </w:rPr>
         <w:fldChar w:fldCharType="begin"/>
       </w:r>
       <w:r>
+        <w:rPr>
+          <w:rFonts w:ascii="Times New Roman" w:hAnsi="Times New Roman" w:cs="Times New Roman"/>
+        </w:rPr>
         <w:instrText xml:space="preserve"> SEQ Figura \* ARABIC </w:instrText>
       </w:r>
       <w:r>
+        <w:rPr>
+          <w:rFonts w:ascii="Times New Roman" w:hAnsi="Times New Roman" w:cs="Times New Roman"/>
+        </w:rPr>
         <w:fldChar w:fldCharType="separate"/>
       </w:r>
       <w:r>
         <w:rPr>
+          <w:rFonts w:ascii="Times New Roman" w:hAnsi="Times New Roman" w:cs="Times New Roman"/>
           <w:noProof/>
         </w:rPr>
         <w:t>13</w:t>
       </w:r>
       <w:r>
         <w:rPr>
+          <w:rFonts w:ascii="Times New Roman" w:hAnsi="Times New Roman" w:cs="Times New Roman"/>
           <w:noProof/>
         </w:rPr>
         <w:fldChar w:fldCharType="end"/>
       </w:r>
       <w:r>
+        <w:rPr>
+          <w:rFonts w:ascii="Times New Roman" w:hAnsi="Times New Roman" w:cs="Times New Roman"/>
+        </w:rPr>
         <w:t xml:space="preserve"> Diagrama UML</w:t>
       </w:r>
     </w:p>
@@ -2327,23 +2405,7 @@
           <w:i/>
           <w:iCs/>
         </w:rPr>
-        <w:t>Pedido</w:t>
-      </w:r>
-      <w:r>
-        <w:rPr>
-          <w:rFonts w:ascii="Times New Roman" w:hAnsi="Times New Roman" w:cs="Times New Roman"/>
-          <w:i/>
-          <w:iCs/>
-        </w:rPr>
-        <w:t xml:space="preserve"> e </w:t>
-      </w:r>
-      <w:r>
-        <w:rPr>
-          <w:rFonts w:ascii="Times New Roman" w:hAnsi="Times New Roman" w:cs="Times New Roman"/>
-          <w:i/>
-          <w:iCs/>
-        </w:rPr>
-        <w:t xml:space="preserve">Cafeteira </w:t>
+        <w:t xml:space="preserve">Pedido e Cafeteira </w:t>
       </w:r>
       <w:r>
         <w:rPr>
@@ -2356,9 +2418,13 @@
       <w:pPr>
         <w:keepNext/>
         <w:jc w:val="center"/>
-      </w:pPr>
-      <w:r>
-        <w:rPr>
+        <w:rPr>
+          <w:rFonts w:ascii="Times New Roman" w:hAnsi="Times New Roman" w:cs="Times New Roman"/>
+        </w:rPr>
+      </w:pPr>
+      <w:r>
+        <w:rPr>
+          <w:rFonts w:ascii="Times New Roman" w:hAnsi="Times New Roman" w:cs="Times New Roman"/>
           <w:noProof/>
         </w:rPr>
         <w:drawing>
@@ -2402,45 +2468,71 @@
       <w:pPr>
         <w:pStyle w:val="Legenda"/>
         <w:jc w:val="center"/>
-      </w:pPr>
-      <w:r>
+        <w:rPr>
+          <w:rFonts w:ascii="Times New Roman" w:hAnsi="Times New Roman" w:cs="Times New Roman"/>
+        </w:rPr>
+      </w:pPr>
+      <w:r>
+        <w:rPr>
+          <w:rFonts w:ascii="Times New Roman" w:hAnsi="Times New Roman" w:cs="Times New Roman"/>
+        </w:rPr>
         <w:t xml:space="preserve">Figura </w:t>
       </w:r>
       <w:r>
+        <w:rPr>
+          <w:rFonts w:ascii="Times New Roman" w:hAnsi="Times New Roman" w:cs="Times New Roman"/>
+        </w:rPr>
         <w:fldChar w:fldCharType="begin"/>
       </w:r>
       <w:r>
+        <w:rPr>
+          <w:rFonts w:ascii="Times New Roman" w:hAnsi="Times New Roman" w:cs="Times New Roman"/>
+        </w:rPr>
         <w:instrText xml:space="preserve"> SEQ Figura \* ARABIC </w:instrText>
       </w:r>
       <w:r>
+        <w:rPr>
+          <w:rFonts w:ascii="Times New Roman" w:hAnsi="Times New Roman" w:cs="Times New Roman"/>
+        </w:rPr>
         <w:fldChar w:fldCharType="separate"/>
       </w:r>
       <w:r>
         <w:rPr>
+          <w:rFonts w:ascii="Times New Roman" w:hAnsi="Times New Roman" w:cs="Times New Roman"/>
           <w:noProof/>
         </w:rPr>
         <w:t>14</w:t>
       </w:r>
       <w:r>
         <w:rPr>
+          <w:rFonts w:ascii="Times New Roman" w:hAnsi="Times New Roman" w:cs="Times New Roman"/>
           <w:noProof/>
         </w:rPr>
         <w:fldChar w:fldCharType="end"/>
       </w:r>
       <w:r>
-        <w:t xml:space="preserve"> </w:t>
-      </w:r>
-      <w:r>
-        <w:t>Módulo principal com classes, instâncias e métodos</w:t>
-      </w:r>
-    </w:p>
-    <w:p>
-      <w:r>
+        <w:rPr>
+          <w:rFonts w:ascii="Times New Roman" w:hAnsi="Times New Roman" w:cs="Times New Roman"/>
+        </w:rPr>
+        <w:t xml:space="preserve"> Módulo com classes, instâncias e métodos</w:t>
+      </w:r>
+    </w:p>
+    <w:p>
+      <w:pPr>
+        <w:rPr>
+          <w:rFonts w:ascii="Times New Roman" w:hAnsi="Times New Roman" w:cs="Times New Roman"/>
+        </w:rPr>
+      </w:pPr>
+      <w:r>
+        <w:rPr>
+          <w:rFonts w:ascii="Times New Roman" w:hAnsi="Times New Roman" w:cs="Times New Roman"/>
+        </w:rPr>
         <w:t xml:space="preserve">Novamente com a função </w:t>
       </w:r>
       <w:proofErr w:type="spellStart"/>
       <w:r>
         <w:rPr>
+          <w:rFonts w:ascii="Times New Roman" w:hAnsi="Times New Roman" w:cs="Times New Roman"/>
           <w:i/>
           <w:iCs/>
         </w:rPr>
@@ -2449,6 +2541,7 @@
       <w:proofErr w:type="spellEnd"/>
       <w:r>
         <w:rPr>
+          <w:rFonts w:ascii="Times New Roman" w:hAnsi="Times New Roman" w:cs="Times New Roman"/>
           <w:i/>
           <w:iCs/>
         </w:rPr>
@@ -2458,6 +2551,7 @@
       <w:proofErr w:type="gramStart"/>
       <w:r>
         <w:rPr>
+          <w:rFonts w:ascii="Times New Roman" w:hAnsi="Times New Roman" w:cs="Times New Roman"/>
           <w:i/>
           <w:iCs/>
         </w:rPr>
@@ -2466,6 +2560,7 @@
       <w:proofErr w:type="spellEnd"/>
       <w:r>
         <w:rPr>
+          <w:rFonts w:ascii="Times New Roman" w:hAnsi="Times New Roman" w:cs="Times New Roman"/>
           <w:i/>
           <w:iCs/>
         </w:rPr>
@@ -2474,27 +2569,38 @@
       <w:proofErr w:type="gramEnd"/>
       <w:r>
         <w:rPr>
+          <w:rFonts w:ascii="Times New Roman" w:hAnsi="Times New Roman" w:cs="Times New Roman"/>
           <w:i/>
           <w:iCs/>
         </w:rPr>
         <w:t>)</w:t>
       </w:r>
       <w:r>
+        <w:rPr>
+          <w:rFonts w:ascii="Times New Roman" w:hAnsi="Times New Roman" w:cs="Times New Roman"/>
+        </w:rPr>
         <w:t xml:space="preserve"> para lançamento de exceções.</w:t>
       </w:r>
     </w:p>
     <w:p>
       <w:pPr>
         <w:jc w:val="center"/>
+        <w:rPr>
+          <w:rFonts w:ascii="Times New Roman" w:hAnsi="Times New Roman" w:cs="Times New Roman"/>
+        </w:rPr>
       </w:pPr>
     </w:p>
     <w:p>
       <w:pPr>
         <w:keepNext/>
         <w:jc w:val="center"/>
-      </w:pPr>
-      <w:r>
-        <w:rPr>
+        <w:rPr>
+          <w:rFonts w:ascii="Times New Roman" w:hAnsi="Times New Roman" w:cs="Times New Roman"/>
+        </w:rPr>
+      </w:pPr>
+      <w:r>
+        <w:rPr>
+          <w:rFonts w:ascii="Times New Roman" w:hAnsi="Times New Roman" w:cs="Times New Roman"/>
           <w:noProof/>
         </w:rPr>
         <w:drawing>
@@ -2539,47 +2645,57 @@
         <w:pStyle w:val="Legenda"/>
         <w:jc w:val="center"/>
         <w:rPr>
-          <w:noProof/>
-        </w:rPr>
-      </w:pPr>
-      <w:r>
+          <w:rFonts w:ascii="Times New Roman" w:hAnsi="Times New Roman" w:cs="Times New Roman"/>
+          <w:noProof/>
+        </w:rPr>
+      </w:pPr>
+      <w:r>
+        <w:rPr>
+          <w:rFonts w:ascii="Times New Roman" w:hAnsi="Times New Roman" w:cs="Times New Roman"/>
+        </w:rPr>
         <w:t xml:space="preserve">Figura </w:t>
       </w:r>
       <w:r>
+        <w:rPr>
+          <w:rFonts w:ascii="Times New Roman" w:hAnsi="Times New Roman" w:cs="Times New Roman"/>
+        </w:rPr>
         <w:fldChar w:fldCharType="begin"/>
       </w:r>
       <w:r>
+        <w:rPr>
+          <w:rFonts w:ascii="Times New Roman" w:hAnsi="Times New Roman" w:cs="Times New Roman"/>
+        </w:rPr>
         <w:instrText xml:space="preserve"> SEQ Figura \* ARABIC </w:instrText>
       </w:r>
       <w:r>
+        <w:rPr>
+          <w:rFonts w:ascii="Times New Roman" w:hAnsi="Times New Roman" w:cs="Times New Roman"/>
+        </w:rPr>
         <w:fldChar w:fldCharType="separate"/>
       </w:r>
       <w:r>
         <w:rPr>
+          <w:rFonts w:ascii="Times New Roman" w:hAnsi="Times New Roman" w:cs="Times New Roman"/>
           <w:noProof/>
         </w:rPr>
         <w:t>15</w:t>
       </w:r>
       <w:r>
         <w:rPr>
+          <w:rFonts w:ascii="Times New Roman" w:hAnsi="Times New Roman" w:cs="Times New Roman"/>
           <w:noProof/>
         </w:rPr>
         <w:fldChar w:fldCharType="end"/>
       </w:r>
       <w:r>
-        <w:t xml:space="preserve"> </w:t>
-      </w:r>
-      <w:r>
-        <w:t xml:space="preserve">Exceção lançada quando </w:t>
-      </w:r>
-      <w:r>
-        <w:t>pedido</w:t>
-      </w:r>
-      <w:r>
-        <w:t xml:space="preserve"> é um valor negativo</w:t>
-      </w:r>
-      <w:r>
-        <w:rPr>
+        <w:rPr>
+          <w:rFonts w:ascii="Times New Roman" w:hAnsi="Times New Roman" w:cs="Times New Roman"/>
+        </w:rPr>
+        <w:t xml:space="preserve"> Exceção lançada quando pedido é um valor negativo</w:t>
+      </w:r>
+      <w:r>
+        <w:rPr>
+          <w:rFonts w:ascii="Times New Roman" w:hAnsi="Times New Roman" w:cs="Times New Roman"/>
           <w:noProof/>
         </w:rPr>
         <w:t xml:space="preserve"> ou 0</w:t>
@@ -2588,15 +2704,22 @@
     <w:p>
       <w:pPr>
         <w:jc w:val="center"/>
+        <w:rPr>
+          <w:rFonts w:ascii="Times New Roman" w:hAnsi="Times New Roman" w:cs="Times New Roman"/>
+        </w:rPr>
       </w:pPr>
     </w:p>
     <w:p>
       <w:pPr>
         <w:keepNext/>
         <w:jc w:val="center"/>
-      </w:pPr>
-      <w:r>
-        <w:rPr>
+        <w:rPr>
+          <w:rFonts w:ascii="Times New Roman" w:hAnsi="Times New Roman" w:cs="Times New Roman"/>
+        </w:rPr>
+      </w:pPr>
+      <w:r>
+        <w:rPr>
+          <w:rFonts w:ascii="Times New Roman" w:hAnsi="Times New Roman" w:cs="Times New Roman"/>
           <w:noProof/>
         </w:rPr>
         <w:drawing>
@@ -2640,70 +2763,113 @@
       <w:pPr>
         <w:pStyle w:val="Legenda"/>
         <w:jc w:val="center"/>
-      </w:pPr>
-      <w:r>
+        <w:rPr>
+          <w:rFonts w:ascii="Times New Roman" w:hAnsi="Times New Roman" w:cs="Times New Roman"/>
+        </w:rPr>
+      </w:pPr>
+      <w:r>
+        <w:rPr>
+          <w:rFonts w:ascii="Times New Roman" w:hAnsi="Times New Roman" w:cs="Times New Roman"/>
+        </w:rPr>
         <w:t xml:space="preserve">Figura </w:t>
       </w:r>
       <w:r>
+        <w:rPr>
+          <w:rFonts w:ascii="Times New Roman" w:hAnsi="Times New Roman" w:cs="Times New Roman"/>
+        </w:rPr>
         <w:fldChar w:fldCharType="begin"/>
       </w:r>
       <w:r>
+        <w:rPr>
+          <w:rFonts w:ascii="Times New Roman" w:hAnsi="Times New Roman" w:cs="Times New Roman"/>
+        </w:rPr>
         <w:instrText xml:space="preserve"> SEQ Figura \* ARABIC </w:instrText>
       </w:r>
       <w:r>
+        <w:rPr>
+          <w:rFonts w:ascii="Times New Roman" w:hAnsi="Times New Roman" w:cs="Times New Roman"/>
+        </w:rPr>
         <w:fldChar w:fldCharType="separate"/>
       </w:r>
       <w:r>
         <w:rPr>
+          <w:rFonts w:ascii="Times New Roman" w:hAnsi="Times New Roman" w:cs="Times New Roman"/>
           <w:noProof/>
         </w:rPr>
         <w:t>16</w:t>
       </w:r>
       <w:r>
         <w:rPr>
+          <w:rFonts w:ascii="Times New Roman" w:hAnsi="Times New Roman" w:cs="Times New Roman"/>
           <w:noProof/>
         </w:rPr>
         <w:fldChar w:fldCharType="end"/>
       </w:r>
       <w:r>
+        <w:rPr>
+          <w:rFonts w:ascii="Times New Roman" w:hAnsi="Times New Roman" w:cs="Times New Roman"/>
+        </w:rPr>
         <w:t xml:space="preserve"> </w:t>
       </w:r>
       <w:proofErr w:type="spellStart"/>
       <w:r>
+        <w:rPr>
+          <w:rFonts w:ascii="Times New Roman" w:hAnsi="Times New Roman" w:cs="Times New Roman"/>
+        </w:rPr>
         <w:t>Main</w:t>
       </w:r>
       <w:proofErr w:type="spellEnd"/>
       <w:r>
+        <w:rPr>
+          <w:rFonts w:ascii="Times New Roman" w:hAnsi="Times New Roman" w:cs="Times New Roman"/>
+        </w:rPr>
         <w:t xml:space="preserve"> com objetos criados e testes feitos</w:t>
       </w:r>
     </w:p>
     <w:p>
-      <w:r>
+      <w:pPr>
+        <w:rPr>
+          <w:rFonts w:ascii="Times New Roman" w:hAnsi="Times New Roman" w:cs="Times New Roman"/>
+        </w:rPr>
+      </w:pPr>
+      <w:r>
+        <w:rPr>
+          <w:rFonts w:ascii="Times New Roman" w:hAnsi="Times New Roman" w:cs="Times New Roman"/>
+        </w:rPr>
         <w:t xml:space="preserve">Aqui há troca de mensagens entre objetos, </w:t>
       </w:r>
       <w:r>
         <w:rPr>
+          <w:rFonts w:ascii="Times New Roman" w:hAnsi="Times New Roman" w:cs="Times New Roman"/>
           <w:i/>
           <w:iCs/>
         </w:rPr>
         <w:t>pedido1</w:t>
       </w:r>
       <w:r>
+        <w:rPr>
+          <w:rFonts w:ascii="Times New Roman" w:hAnsi="Times New Roman" w:cs="Times New Roman"/>
+        </w:rPr>
         <w:t xml:space="preserve"> é um objeto de </w:t>
       </w:r>
       <w:r>
         <w:rPr>
+          <w:rFonts w:ascii="Times New Roman" w:hAnsi="Times New Roman" w:cs="Times New Roman"/>
           <w:i/>
           <w:iCs/>
         </w:rPr>
         <w:t>Pedido</w:t>
       </w:r>
       <w:r>
+        <w:rPr>
+          <w:rFonts w:ascii="Times New Roman" w:hAnsi="Times New Roman" w:cs="Times New Roman"/>
+        </w:rPr>
         <w:t xml:space="preserve"> e </w:t>
       </w:r>
       <w:proofErr w:type="spellStart"/>
       <w:r>
         <w:rPr>
+          <w:rFonts w:ascii="Times New Roman" w:hAnsi="Times New Roman" w:cs="Times New Roman"/>
           <w:i/>
           <w:iCs/>
         </w:rPr>
@@ -2712,6 +2878,7 @@
       <w:proofErr w:type="gramStart"/>
       <w:r>
         <w:rPr>
+          <w:rFonts w:ascii="Times New Roman" w:hAnsi="Times New Roman" w:cs="Times New Roman"/>
           <w:i/>
           <w:iCs/>
         </w:rPr>
@@ -2720,6 +2887,7 @@
       <w:proofErr w:type="spellEnd"/>
       <w:r>
         <w:rPr>
+          <w:rFonts w:ascii="Times New Roman" w:hAnsi="Times New Roman" w:cs="Times New Roman"/>
           <w:i/>
           <w:iCs/>
         </w:rPr>
@@ -2728,36 +2896,38 @@
       <w:proofErr w:type="gramEnd"/>
       <w:r>
         <w:rPr>
+          <w:rFonts w:ascii="Times New Roman" w:hAnsi="Times New Roman" w:cs="Times New Roman"/>
           <w:i/>
           <w:iCs/>
         </w:rPr>
         <w:t>)</w:t>
       </w:r>
       <w:r>
+        <w:rPr>
+          <w:rFonts w:ascii="Times New Roman" w:hAnsi="Times New Roman" w:cs="Times New Roman"/>
+        </w:rPr>
         <w:t xml:space="preserve"> é um método da classe </w:t>
       </w:r>
       <w:r>
         <w:rPr>
+          <w:rFonts w:ascii="Times New Roman" w:hAnsi="Times New Roman" w:cs="Times New Roman"/>
           <w:i/>
           <w:iCs/>
         </w:rPr>
-        <w:t>Cafeteira</w:t>
-      </w:r>
-      <w:r>
-        <w:rPr>
-          <w:i/>
-          <w:iCs/>
-        </w:rPr>
-        <w:t>.</w:t>
+        <w:t>Cafeteira.</w:t>
       </w:r>
     </w:p>
     <w:p>
       <w:pPr>
         <w:keepNext/>
         <w:jc w:val="center"/>
-      </w:pPr>
-      <w:r>
-        <w:rPr>
+        <w:rPr>
+          <w:rFonts w:ascii="Times New Roman" w:hAnsi="Times New Roman" w:cs="Times New Roman"/>
+        </w:rPr>
+      </w:pPr>
+      <w:r>
+        <w:rPr>
+          <w:rFonts w:ascii="Times New Roman" w:hAnsi="Times New Roman" w:cs="Times New Roman"/>
           <w:noProof/>
         </w:rPr>
         <w:lastRenderedPageBreak/>
@@ -2802,43 +2972,73 @@
       <w:pPr>
         <w:pStyle w:val="Legenda"/>
         <w:jc w:val="center"/>
-      </w:pPr>
-      <w:r>
+        <w:rPr>
+          <w:rFonts w:ascii="Times New Roman" w:hAnsi="Times New Roman" w:cs="Times New Roman"/>
+        </w:rPr>
+      </w:pPr>
+      <w:r>
+        <w:rPr>
+          <w:rFonts w:ascii="Times New Roman" w:hAnsi="Times New Roman" w:cs="Times New Roman"/>
+        </w:rPr>
         <w:t xml:space="preserve">Figura </w:t>
       </w:r>
       <w:r>
+        <w:rPr>
+          <w:rFonts w:ascii="Times New Roman" w:hAnsi="Times New Roman" w:cs="Times New Roman"/>
+        </w:rPr>
         <w:fldChar w:fldCharType="begin"/>
       </w:r>
       <w:r>
+        <w:rPr>
+          <w:rFonts w:ascii="Times New Roman" w:hAnsi="Times New Roman" w:cs="Times New Roman"/>
+        </w:rPr>
         <w:instrText xml:space="preserve"> SEQ Figura \* ARABIC </w:instrText>
       </w:r>
       <w:r>
+        <w:rPr>
+          <w:rFonts w:ascii="Times New Roman" w:hAnsi="Times New Roman" w:cs="Times New Roman"/>
+        </w:rPr>
         <w:fldChar w:fldCharType="separate"/>
       </w:r>
       <w:r>
         <w:rPr>
+          <w:rFonts w:ascii="Times New Roman" w:hAnsi="Times New Roman" w:cs="Times New Roman"/>
           <w:noProof/>
         </w:rPr>
         <w:t>17</w:t>
       </w:r>
       <w:r>
         <w:rPr>
+          <w:rFonts w:ascii="Times New Roman" w:hAnsi="Times New Roman" w:cs="Times New Roman"/>
           <w:noProof/>
         </w:rPr>
         <w:fldChar w:fldCharType="end"/>
       </w:r>
       <w:r>
+        <w:rPr>
+          <w:rFonts w:ascii="Times New Roman" w:hAnsi="Times New Roman" w:cs="Times New Roman"/>
+        </w:rPr>
         <w:t xml:space="preserve"> Saída no terminal</w:t>
       </w:r>
     </w:p>
-    <w:p/>
+    <w:p>
+      <w:pPr>
+        <w:rPr>
+          <w:rFonts w:ascii="Times New Roman" w:hAnsi="Times New Roman" w:cs="Times New Roman"/>
+        </w:rPr>
+      </w:pPr>
+    </w:p>
     <w:p>
       <w:pPr>
         <w:keepNext/>
         <w:jc w:val="center"/>
-      </w:pPr>
-      <w:r>
-        <w:rPr>
+        <w:rPr>
+          <w:rFonts w:ascii="Times New Roman" w:hAnsi="Times New Roman" w:cs="Times New Roman"/>
+        </w:rPr>
+      </w:pPr>
+      <w:r>
+        <w:rPr>
+          <w:rFonts w:ascii="Times New Roman" w:hAnsi="Times New Roman" w:cs="Times New Roman"/>
           <w:noProof/>
         </w:rPr>
         <w:drawing>
@@ -3171,6 +3371,7 @@
         <w:rPr>
           <w:rFonts w:ascii="Times New Roman" w:hAnsi="Times New Roman" w:cs="Times New Roman"/>
           <w:noProof/>
+          <w:u w:val="single"/>
         </w:rPr>
       </w:pPr>
       <w:r>
@@ -3214,7 +3415,13 @@
         <w:rPr>
           <w:rFonts w:ascii="Times New Roman" w:hAnsi="Times New Roman" w:cs="Times New Roman"/>
         </w:rPr>
-        <w:t xml:space="preserve"> Módulo principal</w:t>
+        <w:t xml:space="preserve"> Módulo </w:t>
+      </w:r>
+      <w:r>
+        <w:rPr>
+          <w:rFonts w:ascii="Times New Roman" w:hAnsi="Times New Roman" w:cs="Times New Roman"/>
+        </w:rPr>
+        <w:t>com classes e métodos</w:t>
       </w:r>
     </w:p>
     <w:p>
@@ -4363,22 +4570,199 @@
       <w:pPr>
         <w:rPr>
           <w:rFonts w:ascii="Times New Roman" w:hAnsi="Times New Roman" w:cs="Times New Roman"/>
-          <w:color w:val="FF0000"/>
-        </w:rPr>
-      </w:pPr>
-      <w:r>
-        <w:rPr>
-          <w:rFonts w:ascii="Times New Roman" w:hAnsi="Times New Roman" w:cs="Times New Roman"/>
-          <w:color w:val="FF0000"/>
-        </w:rPr>
-        <w:t xml:space="preserve">A diferença é que enquanto na herança simples, cada classe terá apenas uma subclasse, </w:t>
-      </w:r>
-      <w:r>
-        <w:rPr>
-          <w:rFonts w:ascii="Times New Roman" w:hAnsi="Times New Roman" w:cs="Times New Roman"/>
-          <w:color w:val="FF0000"/>
-        </w:rPr>
-        <w:t>na herança múltipla</w:t>
+        </w:rPr>
+      </w:pPr>
+      <w:r>
+        <w:rPr>
+          <w:rFonts w:ascii="Times New Roman" w:hAnsi="Times New Roman" w:cs="Times New Roman"/>
+        </w:rPr>
+        <w:t xml:space="preserve">Na herança simples, a classe filha herda apenas uma única classe mãe. </w:t>
+      </w:r>
+    </w:p>
+    <w:p>
+      <w:pPr>
+        <w:rPr>
+          <w:rFonts w:ascii="Times New Roman" w:hAnsi="Times New Roman" w:cs="Times New Roman"/>
+        </w:rPr>
+      </w:pPr>
+      <w:r>
+        <w:rPr>
+          <w:rFonts w:ascii="Times New Roman" w:hAnsi="Times New Roman" w:cs="Times New Roman"/>
+        </w:rPr>
+        <w:t xml:space="preserve">Exemplos: </w:t>
+      </w:r>
+    </w:p>
+    <w:p>
+      <w:pPr>
+        <w:pStyle w:val="PargrafodaLista"/>
+        <w:numPr>
+          <w:ilvl w:val="0"/>
+          <w:numId w:val="1"/>
+        </w:numPr>
+        <w:rPr>
+          <w:rFonts w:ascii="Times New Roman" w:hAnsi="Times New Roman" w:cs="Times New Roman"/>
+        </w:rPr>
+      </w:pPr>
+      <w:proofErr w:type="spellStart"/>
+      <w:r>
+        <w:rPr>
+          <w:rFonts w:ascii="Times New Roman" w:hAnsi="Times New Roman" w:cs="Times New Roman"/>
+        </w:rPr>
+        <w:t>UsuarioComum</w:t>
+      </w:r>
+      <w:proofErr w:type="spellEnd"/>
+      <w:r>
+        <w:rPr>
+          <w:rFonts w:ascii="Times New Roman" w:hAnsi="Times New Roman" w:cs="Times New Roman"/>
+        </w:rPr>
+        <w:t xml:space="preserve"> (subclasse) herda de </w:t>
+      </w:r>
+      <w:proofErr w:type="spellStart"/>
+      <w:r>
+        <w:rPr>
+          <w:rFonts w:ascii="Times New Roman" w:hAnsi="Times New Roman" w:cs="Times New Roman"/>
+        </w:rPr>
+        <w:t>Usuario</w:t>
+      </w:r>
+      <w:proofErr w:type="spellEnd"/>
+      <w:r>
+        <w:rPr>
+          <w:rFonts w:ascii="Times New Roman" w:hAnsi="Times New Roman" w:cs="Times New Roman"/>
+        </w:rPr>
+        <w:t xml:space="preserve"> (superclasse);</w:t>
+      </w:r>
+    </w:p>
+    <w:p>
+      <w:pPr>
+        <w:pStyle w:val="PargrafodaLista"/>
+        <w:numPr>
+          <w:ilvl w:val="0"/>
+          <w:numId w:val="1"/>
+        </w:numPr>
+        <w:rPr>
+          <w:rFonts w:ascii="Times New Roman" w:hAnsi="Times New Roman" w:cs="Times New Roman"/>
+        </w:rPr>
+      </w:pPr>
+      <w:r>
+        <w:rPr>
+          <w:rFonts w:ascii="Times New Roman" w:hAnsi="Times New Roman" w:cs="Times New Roman"/>
+        </w:rPr>
+        <w:t xml:space="preserve">Moto (subclasse) herda de Veiculo (superclasse), Carro </w:t>
+      </w:r>
+      <w:r>
+        <w:rPr>
+          <w:rFonts w:ascii="Times New Roman" w:hAnsi="Times New Roman" w:cs="Times New Roman"/>
+        </w:rPr>
+        <w:t>(subclasse)</w:t>
+      </w:r>
+      <w:r>
+        <w:rPr>
+          <w:rFonts w:ascii="Times New Roman" w:hAnsi="Times New Roman" w:cs="Times New Roman"/>
+        </w:rPr>
+        <w:t xml:space="preserve"> herda de </w:t>
+      </w:r>
+      <w:proofErr w:type="spellStart"/>
+      <w:r>
+        <w:rPr>
+          <w:rFonts w:ascii="Times New Roman" w:hAnsi="Times New Roman" w:cs="Times New Roman"/>
+        </w:rPr>
+        <w:t>Veiculo</w:t>
+      </w:r>
+      <w:proofErr w:type="spellEnd"/>
+      <w:r>
+        <w:rPr>
+          <w:rFonts w:ascii="Times New Roman" w:hAnsi="Times New Roman" w:cs="Times New Roman"/>
+        </w:rPr>
+        <w:t>.</w:t>
+      </w:r>
+    </w:p>
+    <w:p>
+      <w:pPr>
+        <w:rPr>
+          <w:rFonts w:ascii="Times New Roman" w:hAnsi="Times New Roman" w:cs="Times New Roman"/>
+        </w:rPr>
+      </w:pPr>
+    </w:p>
+    <w:p>
+      <w:pPr>
+        <w:rPr>
+          <w:rFonts w:ascii="Times New Roman" w:hAnsi="Times New Roman" w:cs="Times New Roman"/>
+        </w:rPr>
+      </w:pPr>
+      <w:r>
+        <w:rPr>
+          <w:rFonts w:ascii="Times New Roman" w:hAnsi="Times New Roman" w:cs="Times New Roman"/>
+        </w:rPr>
+        <w:t>Na herança múltipla, uma classe filha herda de duas ou mais classes mães ao mesmo tempo.</w:t>
+      </w:r>
+    </w:p>
+    <w:p>
+      <w:pPr>
+        <w:rPr>
+          <w:rFonts w:ascii="Times New Roman" w:hAnsi="Times New Roman" w:cs="Times New Roman"/>
+        </w:rPr>
+      </w:pPr>
+      <w:r>
+        <w:rPr>
+          <w:rFonts w:ascii="Times New Roman" w:hAnsi="Times New Roman" w:cs="Times New Roman"/>
+        </w:rPr>
+        <w:t>Exemplo:</w:t>
+      </w:r>
+    </w:p>
+    <w:p>
+      <w:pPr>
+        <w:pStyle w:val="PargrafodaLista"/>
+        <w:numPr>
+          <w:ilvl w:val="0"/>
+          <w:numId w:val="1"/>
+        </w:numPr>
+        <w:rPr>
+          <w:rFonts w:ascii="Times New Roman" w:hAnsi="Times New Roman" w:cs="Times New Roman"/>
+        </w:rPr>
+      </w:pPr>
+      <w:r>
+        <w:rPr>
+          <w:rFonts w:ascii="Times New Roman" w:hAnsi="Times New Roman" w:cs="Times New Roman"/>
+        </w:rPr>
+        <w:t xml:space="preserve">Professor (subclasse) herda de Pessoa </w:t>
+      </w:r>
+      <w:r>
+        <w:rPr>
+          <w:rFonts w:ascii="Times New Roman" w:hAnsi="Times New Roman" w:cs="Times New Roman"/>
+        </w:rPr>
+        <w:t>(superclasse)</w:t>
+      </w:r>
+      <w:r>
+        <w:rPr>
+          <w:rFonts w:ascii="Times New Roman" w:hAnsi="Times New Roman" w:cs="Times New Roman"/>
+        </w:rPr>
+        <w:t xml:space="preserve"> </w:t>
+      </w:r>
+      <w:proofErr w:type="gramStart"/>
+      <w:r>
+        <w:rPr>
+          <w:rFonts w:ascii="Times New Roman" w:hAnsi="Times New Roman" w:cs="Times New Roman"/>
+        </w:rPr>
+        <w:t>e Trabalhador</w:t>
+      </w:r>
+      <w:proofErr w:type="gramEnd"/>
+      <w:r>
+        <w:rPr>
+          <w:rFonts w:ascii="Times New Roman" w:hAnsi="Times New Roman" w:cs="Times New Roman"/>
+        </w:rPr>
+        <w:t xml:space="preserve"> </w:t>
+      </w:r>
+      <w:r>
+        <w:rPr>
+          <w:rFonts w:ascii="Times New Roman" w:hAnsi="Times New Roman" w:cs="Times New Roman"/>
+        </w:rPr>
+        <w:t>(superclasse)</w:t>
+      </w:r>
+      <w:r>
+        <w:rPr>
+          <w:rFonts w:ascii="Times New Roman" w:hAnsi="Times New Roman" w:cs="Times New Roman"/>
+        </w:rPr>
+        <w:t>.</w:t>
       </w:r>
     </w:p>
     <w:p>
@@ -4406,31 +4790,26 @@
           <w:b/>
           <w:bCs/>
         </w:rPr>
-        <w:t xml:space="preserve">Exercício </w:t>
-      </w:r>
-      <w:r>
+        <w:t>Exercício 3</w:t>
+      </w:r>
+    </w:p>
+    <w:p>
+      <w:pPr>
+        <w:jc w:val="center"/>
         <w:rPr>
           <w:rFonts w:ascii="Times New Roman" w:hAnsi="Times New Roman" w:cs="Times New Roman"/>
           <w:b/>
           <w:bCs/>
         </w:rPr>
-        <w:t>3</w:t>
-      </w:r>
-    </w:p>
-    <w:p>
-      <w:pPr>
-        <w:jc w:val="center"/>
-        <w:rPr>
-          <w:rFonts w:ascii="Times New Roman" w:hAnsi="Times New Roman" w:cs="Times New Roman"/>
-          <w:b/>
-          <w:bCs/>
-        </w:rPr>
       </w:pPr>
     </w:p>
     <w:p>
       <w:pPr>
         <w:keepNext/>
         <w:jc w:val="center"/>
+        <w:rPr>
+          <w:rFonts w:ascii="Times New Roman" w:hAnsi="Times New Roman" w:cs="Times New Roman"/>
+        </w:rPr>
       </w:pPr>
       <w:r>
         <w:rPr>
@@ -4493,29 +4872,81 @@
       <w:pPr>
         <w:pStyle w:val="Legenda"/>
         <w:jc w:val="center"/>
-      </w:pPr>
-      <w:r>
+        <w:rPr>
+          <w:rFonts w:ascii="Times New Roman" w:hAnsi="Times New Roman" w:cs="Times New Roman"/>
+        </w:rPr>
+      </w:pPr>
+      <w:r>
+        <w:rPr>
+          <w:rFonts w:ascii="Times New Roman" w:hAnsi="Times New Roman" w:cs="Times New Roman"/>
+        </w:rPr>
         <w:t xml:space="preserve">Figura </w:t>
       </w:r>
-      <w:fldSimple w:instr=" SEQ Figura \* ARABIC ">
-        <w:r>
-          <w:rPr>
-            <w:noProof/>
-          </w:rPr>
-          <w:t>28</w:t>
-        </w:r>
-      </w:fldSimple>
-      <w:r>
-        <w:t xml:space="preserve"> Módulo principal</w:t>
-      </w:r>
-    </w:p>
-    <w:p/>
+      <w:r>
+        <w:rPr>
+          <w:rFonts w:ascii="Times New Roman" w:hAnsi="Times New Roman" w:cs="Times New Roman"/>
+        </w:rPr>
+        <w:fldChar w:fldCharType="begin"/>
+      </w:r>
+      <w:r>
+        <w:rPr>
+          <w:rFonts w:ascii="Times New Roman" w:hAnsi="Times New Roman" w:cs="Times New Roman"/>
+        </w:rPr>
+        <w:instrText xml:space="preserve"> SEQ Figura \* ARABIC </w:instrText>
+      </w:r>
+      <w:r>
+        <w:rPr>
+          <w:rFonts w:ascii="Times New Roman" w:hAnsi="Times New Roman" w:cs="Times New Roman"/>
+        </w:rPr>
+        <w:fldChar w:fldCharType="separate"/>
+      </w:r>
+      <w:r>
+        <w:rPr>
+          <w:rFonts w:ascii="Times New Roman" w:hAnsi="Times New Roman" w:cs="Times New Roman"/>
+          <w:noProof/>
+        </w:rPr>
+        <w:t>28</w:t>
+      </w:r>
+      <w:r>
+        <w:rPr>
+          <w:rFonts w:ascii="Times New Roman" w:hAnsi="Times New Roman" w:cs="Times New Roman"/>
+          <w:noProof/>
+        </w:rPr>
+        <w:fldChar w:fldCharType="end"/>
+      </w:r>
+      <w:r>
+        <w:rPr>
+          <w:rFonts w:ascii="Times New Roman" w:hAnsi="Times New Roman" w:cs="Times New Roman"/>
+        </w:rPr>
+        <w:t xml:space="preserve"> Módulo </w:t>
+      </w:r>
+      <w:r>
+        <w:rPr>
+          <w:rFonts w:ascii="Times New Roman" w:hAnsi="Times New Roman" w:cs="Times New Roman"/>
+        </w:rPr>
+        <w:t>com classes e métodos</w:t>
+      </w:r>
+    </w:p>
+    <w:p>
+      <w:pPr>
+        <w:rPr>
+          <w:rFonts w:ascii="Times New Roman" w:hAnsi="Times New Roman" w:cs="Times New Roman"/>
+        </w:rPr>
+      </w:pPr>
+    </w:p>
     <w:p>
       <w:pPr>
         <w:keepNext/>
         <w:jc w:val="center"/>
-      </w:pPr>
-      <w:r>
+        <w:rPr>
+          <w:rFonts w:ascii="Times New Roman" w:hAnsi="Times New Roman" w:cs="Times New Roman"/>
+        </w:rPr>
+      </w:pPr>
+      <w:r>
+        <w:rPr>
+          <w:rFonts w:ascii="Times New Roman" w:hAnsi="Times New Roman" w:cs="Times New Roman"/>
+          <w:noProof/>
+        </w:rPr>
         <w:lastRenderedPageBreak/>
         <w:drawing>
           <wp:inline distT="0" distB="0" distL="0" distR="0" wp14:anchorId="0A369572" wp14:editId="7BD1A661">
@@ -4558,33 +4989,82 @@
       <w:pPr>
         <w:pStyle w:val="Legenda"/>
         <w:jc w:val="center"/>
-      </w:pPr>
-      <w:r>
+        <w:rPr>
+          <w:rFonts w:ascii="Times New Roman" w:hAnsi="Times New Roman" w:cs="Times New Roman"/>
+        </w:rPr>
+      </w:pPr>
+      <w:r>
+        <w:rPr>
+          <w:rFonts w:ascii="Times New Roman" w:hAnsi="Times New Roman" w:cs="Times New Roman"/>
+        </w:rPr>
         <w:t xml:space="preserve">Figura </w:t>
       </w:r>
-      <w:fldSimple w:instr=" SEQ Figura \* ARABIC ">
-        <w:r>
-          <w:rPr>
-            <w:noProof/>
-          </w:rPr>
-          <w:t>29</w:t>
-        </w:r>
-      </w:fldSimple>
-      <w:r>
+      <w:r>
+        <w:rPr>
+          <w:rFonts w:ascii="Times New Roman" w:hAnsi="Times New Roman" w:cs="Times New Roman"/>
+        </w:rPr>
+        <w:fldChar w:fldCharType="begin"/>
+      </w:r>
+      <w:r>
+        <w:rPr>
+          <w:rFonts w:ascii="Times New Roman" w:hAnsi="Times New Roman" w:cs="Times New Roman"/>
+        </w:rPr>
+        <w:instrText xml:space="preserve"> SEQ Figura \* ARABIC </w:instrText>
+      </w:r>
+      <w:r>
+        <w:rPr>
+          <w:rFonts w:ascii="Times New Roman" w:hAnsi="Times New Roman" w:cs="Times New Roman"/>
+        </w:rPr>
+        <w:fldChar w:fldCharType="separate"/>
+      </w:r>
+      <w:r>
+        <w:rPr>
+          <w:rFonts w:ascii="Times New Roman" w:hAnsi="Times New Roman" w:cs="Times New Roman"/>
+          <w:noProof/>
+        </w:rPr>
+        <w:t>29</w:t>
+      </w:r>
+      <w:r>
+        <w:rPr>
+          <w:rFonts w:ascii="Times New Roman" w:hAnsi="Times New Roman" w:cs="Times New Roman"/>
+          <w:noProof/>
+        </w:rPr>
+        <w:fldChar w:fldCharType="end"/>
+      </w:r>
+      <w:r>
+        <w:rPr>
+          <w:rFonts w:ascii="Times New Roman" w:hAnsi="Times New Roman" w:cs="Times New Roman"/>
+        </w:rPr>
         <w:t xml:space="preserve"> </w:t>
       </w:r>
       <w:proofErr w:type="spellStart"/>
       <w:r>
+        <w:rPr>
+          <w:rFonts w:ascii="Times New Roman" w:hAnsi="Times New Roman" w:cs="Times New Roman"/>
+        </w:rPr>
         <w:t>Main</w:t>
       </w:r>
       <w:proofErr w:type="spellEnd"/>
     </w:p>
-    <w:p/>
+    <w:p>
+      <w:pPr>
+        <w:rPr>
+          <w:rFonts w:ascii="Times New Roman" w:hAnsi="Times New Roman" w:cs="Times New Roman"/>
+        </w:rPr>
+      </w:pPr>
+    </w:p>
     <w:p>
       <w:pPr>
         <w:keepNext/>
-      </w:pPr>
-      <w:r>
+        <w:rPr>
+          <w:rFonts w:ascii="Times New Roman" w:hAnsi="Times New Roman" w:cs="Times New Roman"/>
+        </w:rPr>
+      </w:pPr>
+      <w:r>
+        <w:rPr>
+          <w:rFonts w:ascii="Times New Roman" w:hAnsi="Times New Roman" w:cs="Times New Roman"/>
+          <w:noProof/>
+        </w:rPr>
         <w:drawing>
           <wp:inline distT="0" distB="0" distL="0" distR="0" wp14:anchorId="37C04290" wp14:editId="51EF5A47">
             <wp:extent cx="5400040" cy="1602105"/>
@@ -4626,32 +5106,87 @@
       <w:pPr>
         <w:pStyle w:val="Legenda"/>
         <w:jc w:val="center"/>
-      </w:pPr>
-      <w:r>
+        <w:rPr>
+          <w:rFonts w:ascii="Times New Roman" w:hAnsi="Times New Roman" w:cs="Times New Roman"/>
+        </w:rPr>
+      </w:pPr>
+      <w:r>
+        <w:rPr>
+          <w:rFonts w:ascii="Times New Roman" w:hAnsi="Times New Roman" w:cs="Times New Roman"/>
+        </w:rPr>
         <w:t xml:space="preserve">Figura </w:t>
       </w:r>
-      <w:fldSimple w:instr=" SEQ Figura \* ARABIC ">
-        <w:r>
-          <w:rPr>
-            <w:noProof/>
-          </w:rPr>
-          <w:t>30</w:t>
-        </w:r>
-      </w:fldSimple>
-      <w:r>
+      <w:r>
+        <w:rPr>
+          <w:rFonts w:ascii="Times New Roman" w:hAnsi="Times New Roman" w:cs="Times New Roman"/>
+        </w:rPr>
+        <w:fldChar w:fldCharType="begin"/>
+      </w:r>
+      <w:r>
+        <w:rPr>
+          <w:rFonts w:ascii="Times New Roman" w:hAnsi="Times New Roman" w:cs="Times New Roman"/>
+        </w:rPr>
+        <w:instrText xml:space="preserve"> SEQ Figura \* ARABIC </w:instrText>
+      </w:r>
+      <w:r>
+        <w:rPr>
+          <w:rFonts w:ascii="Times New Roman" w:hAnsi="Times New Roman" w:cs="Times New Roman"/>
+        </w:rPr>
+        <w:fldChar w:fldCharType="separate"/>
+      </w:r>
+      <w:r>
+        <w:rPr>
+          <w:rFonts w:ascii="Times New Roman" w:hAnsi="Times New Roman" w:cs="Times New Roman"/>
+          <w:noProof/>
+        </w:rPr>
+        <w:t>30</w:t>
+      </w:r>
+      <w:r>
+        <w:rPr>
+          <w:rFonts w:ascii="Times New Roman" w:hAnsi="Times New Roman" w:cs="Times New Roman"/>
+          <w:noProof/>
+        </w:rPr>
+        <w:fldChar w:fldCharType="end"/>
+      </w:r>
+      <w:r>
+        <w:rPr>
+          <w:rFonts w:ascii="Times New Roman" w:hAnsi="Times New Roman" w:cs="Times New Roman"/>
+        </w:rPr>
         <w:t xml:space="preserve"> Saída no terminal</w:t>
       </w:r>
     </w:p>
-    <w:p/>
-    <w:p/>
-    <w:p/>
+    <w:p>
+      <w:pPr>
+        <w:rPr>
+          <w:rFonts w:ascii="Times New Roman" w:hAnsi="Times New Roman" w:cs="Times New Roman"/>
+        </w:rPr>
+      </w:pPr>
+    </w:p>
+    <w:p>
+      <w:pPr>
+        <w:rPr>
+          <w:rFonts w:ascii="Times New Roman" w:hAnsi="Times New Roman" w:cs="Times New Roman"/>
+        </w:rPr>
+      </w:pPr>
+    </w:p>
+    <w:p>
+      <w:pPr>
+        <w:rPr>
+          <w:rFonts w:ascii="Times New Roman" w:hAnsi="Times New Roman" w:cs="Times New Roman"/>
+        </w:rPr>
+      </w:pPr>
+    </w:p>
     <w:p>
       <w:pPr>
         <w:keepNext/>
         <w:jc w:val="center"/>
-      </w:pPr>
-      <w:r>
-        <w:rPr>
+        <w:rPr>
+          <w:rFonts w:ascii="Times New Roman" w:hAnsi="Times New Roman" w:cs="Times New Roman"/>
+        </w:rPr>
+      </w:pPr>
+      <w:r>
+        <w:rPr>
+          <w:rFonts w:ascii="Times New Roman" w:hAnsi="Times New Roman" w:cs="Times New Roman"/>
           <w:noProof/>
         </w:rPr>
         <w:drawing>
@@ -4708,20 +5243,997 @@
       <w:pPr>
         <w:pStyle w:val="Legenda"/>
         <w:jc w:val="center"/>
-      </w:pPr>
-      <w:r>
+        <w:rPr>
+          <w:rFonts w:ascii="Times New Roman" w:hAnsi="Times New Roman" w:cs="Times New Roman"/>
+        </w:rPr>
+      </w:pPr>
+      <w:r>
+        <w:rPr>
+          <w:rFonts w:ascii="Times New Roman" w:hAnsi="Times New Roman" w:cs="Times New Roman"/>
+        </w:rPr>
         <w:t xml:space="preserve">Figura </w:t>
       </w:r>
-      <w:fldSimple w:instr=" SEQ Figura \* ARABIC ">
-        <w:r>
-          <w:rPr>
-            <w:noProof/>
-          </w:rPr>
-          <w:t>31</w:t>
-        </w:r>
-      </w:fldSimple>
-      <w:r>
+      <w:r>
+        <w:rPr>
+          <w:rFonts w:ascii="Times New Roman" w:hAnsi="Times New Roman" w:cs="Times New Roman"/>
+        </w:rPr>
+        <w:fldChar w:fldCharType="begin"/>
+      </w:r>
+      <w:r>
+        <w:rPr>
+          <w:rFonts w:ascii="Times New Roman" w:hAnsi="Times New Roman" w:cs="Times New Roman"/>
+        </w:rPr>
+        <w:instrText xml:space="preserve"> SEQ Figura \* ARABIC </w:instrText>
+      </w:r>
+      <w:r>
+        <w:rPr>
+          <w:rFonts w:ascii="Times New Roman" w:hAnsi="Times New Roman" w:cs="Times New Roman"/>
+        </w:rPr>
+        <w:fldChar w:fldCharType="separate"/>
+      </w:r>
+      <w:r>
+        <w:rPr>
+          <w:rFonts w:ascii="Times New Roman" w:hAnsi="Times New Roman" w:cs="Times New Roman"/>
+          <w:noProof/>
+        </w:rPr>
+        <w:t>31</w:t>
+      </w:r>
+      <w:r>
+        <w:rPr>
+          <w:rFonts w:ascii="Times New Roman" w:hAnsi="Times New Roman" w:cs="Times New Roman"/>
+          <w:noProof/>
+        </w:rPr>
+        <w:fldChar w:fldCharType="end"/>
+      </w:r>
+      <w:r>
+        <w:rPr>
+          <w:rFonts w:ascii="Times New Roman" w:hAnsi="Times New Roman" w:cs="Times New Roman"/>
+        </w:rPr>
         <w:t xml:space="preserve"> Diagrama UML</w:t>
+      </w:r>
+    </w:p>
+    <w:p>
+      <w:pPr>
+        <w:rPr>
+          <w:rFonts w:ascii="Times New Roman" w:hAnsi="Times New Roman" w:cs="Times New Roman"/>
+        </w:rPr>
+      </w:pPr>
+    </w:p>
+    <w:p>
+      <w:pPr>
+        <w:rPr>
+          <w:rFonts w:ascii="Times New Roman" w:hAnsi="Times New Roman" w:cs="Times New Roman"/>
+        </w:rPr>
+      </w:pPr>
+    </w:p>
+    <w:p>
+      <w:pPr>
+        <w:rPr>
+          <w:rFonts w:ascii="Times New Roman" w:hAnsi="Times New Roman" w:cs="Times New Roman"/>
+        </w:rPr>
+      </w:pPr>
+    </w:p>
+    <w:p>
+      <w:pPr>
+        <w:rPr>
+          <w:rFonts w:ascii="Times New Roman" w:hAnsi="Times New Roman" w:cs="Times New Roman"/>
+        </w:rPr>
+      </w:pPr>
+    </w:p>
+    <w:p>
+      <w:pPr>
+        <w:rPr>
+          <w:rFonts w:ascii="Times New Roman" w:hAnsi="Times New Roman" w:cs="Times New Roman"/>
+        </w:rPr>
+      </w:pPr>
+    </w:p>
+    <w:p>
+      <w:pPr>
+        <w:rPr>
+          <w:rFonts w:ascii="Times New Roman" w:hAnsi="Times New Roman" w:cs="Times New Roman"/>
+        </w:rPr>
+      </w:pPr>
+    </w:p>
+    <w:p>
+      <w:pPr>
+        <w:jc w:val="center"/>
+        <w:rPr>
+          <w:rFonts w:ascii="Times New Roman" w:hAnsi="Times New Roman" w:cs="Times New Roman"/>
+          <w:b/>
+          <w:bCs/>
+        </w:rPr>
+      </w:pPr>
+      <w:r>
+        <w:rPr>
+          <w:rFonts w:ascii="Times New Roman" w:hAnsi="Times New Roman" w:cs="Times New Roman"/>
+          <w:b/>
+          <w:bCs/>
+        </w:rPr>
+        <w:lastRenderedPageBreak/>
+        <w:t xml:space="preserve">Atividade Prática 1 – parte </w:t>
+      </w:r>
+      <w:r>
+        <w:rPr>
+          <w:rFonts w:ascii="Times New Roman" w:hAnsi="Times New Roman" w:cs="Times New Roman"/>
+          <w:b/>
+          <w:bCs/>
+        </w:rPr>
+        <w:t>3</w:t>
+      </w:r>
+      <w:r>
+        <w:rPr>
+          <w:rFonts w:ascii="Times New Roman" w:hAnsi="Times New Roman" w:cs="Times New Roman"/>
+          <w:b/>
+          <w:bCs/>
+        </w:rPr>
+        <w:t xml:space="preserve"> – APPO</w:t>
+      </w:r>
+      <w:r>
+        <w:rPr>
+          <w:rFonts w:ascii="Times New Roman" w:hAnsi="Times New Roman" w:cs="Times New Roman"/>
+          <w:b/>
+          <w:bCs/>
+        </w:rPr>
+        <w:t>O</w:t>
+      </w:r>
+    </w:p>
+    <w:p>
+      <w:pPr>
+        <w:jc w:val="center"/>
+        <w:rPr>
+          <w:rFonts w:ascii="Times New Roman" w:hAnsi="Times New Roman" w:cs="Times New Roman"/>
+          <w:b/>
+          <w:bCs/>
+        </w:rPr>
+      </w:pPr>
+    </w:p>
+    <w:p>
+      <w:pPr>
+        <w:jc w:val="center"/>
+        <w:rPr>
+          <w:rFonts w:ascii="Times New Roman" w:hAnsi="Times New Roman" w:cs="Times New Roman"/>
+          <w:b/>
+          <w:bCs/>
+        </w:rPr>
+      </w:pPr>
+      <w:r>
+        <w:rPr>
+          <w:rFonts w:ascii="Times New Roman" w:hAnsi="Times New Roman" w:cs="Times New Roman"/>
+          <w:b/>
+          <w:bCs/>
+        </w:rPr>
+        <w:t>Exercício 1</w:t>
+      </w:r>
+    </w:p>
+    <w:p>
+      <w:pPr>
+        <w:keepNext/>
+        <w:jc w:val="center"/>
+        <w:rPr>
+          <w:rFonts w:ascii="Times New Roman" w:hAnsi="Times New Roman" w:cs="Times New Roman"/>
+        </w:rPr>
+      </w:pPr>
+      <w:r>
+        <w:rPr>
+          <w:rFonts w:ascii="Times New Roman" w:hAnsi="Times New Roman" w:cs="Times New Roman"/>
+          <w:b/>
+          <w:bCs/>
+        </w:rPr>
+        <w:drawing>
+          <wp:inline distT="0" distB="0" distL="0" distR="0" wp14:anchorId="566CE9FD" wp14:editId="66B01EE8">
+            <wp:extent cx="5400040" cy="3054985"/>
+            <wp:effectExtent l="0" t="0" r="0" b="0"/>
+            <wp:docPr id="6" name="Imagem 6"/>
+            <wp:cNvGraphicFramePr>
+              <a:graphicFrameLocks xmlns:a="http://schemas.openxmlformats.org/drawingml/2006/main" noChangeAspect="1"/>
+            </wp:cNvGraphicFramePr>
+            <a:graphic xmlns:a="http://schemas.openxmlformats.org/drawingml/2006/main">
+              <a:graphicData uri="http://schemas.openxmlformats.org/drawingml/2006/picture">
+                <pic:pic xmlns:pic="http://schemas.openxmlformats.org/drawingml/2006/picture">
+                  <pic:nvPicPr>
+                    <pic:cNvPr id="1" name=""/>
+                    <pic:cNvPicPr/>
+                  </pic:nvPicPr>
+                  <pic:blipFill>
+                    <a:blip r:embed="rId36"/>
+                    <a:stretch>
+                      <a:fillRect/>
+                    </a:stretch>
+                  </pic:blipFill>
+                  <pic:spPr>
+                    <a:xfrm>
+                      <a:off x="0" y="0"/>
+                      <a:ext cx="5400040" cy="3054985"/>
+                    </a:xfrm>
+                    <a:prstGeom prst="rect">
+                      <a:avLst/>
+                    </a:prstGeom>
+                  </pic:spPr>
+                </pic:pic>
+              </a:graphicData>
+            </a:graphic>
+          </wp:inline>
+        </w:drawing>
+      </w:r>
+    </w:p>
+    <w:p>
+      <w:pPr>
+        <w:pStyle w:val="Legenda"/>
+        <w:jc w:val="center"/>
+        <w:rPr>
+          <w:rFonts w:ascii="Times New Roman" w:hAnsi="Times New Roman" w:cs="Times New Roman"/>
+          <w:b/>
+          <w:bCs/>
+        </w:rPr>
+      </w:pPr>
+      <w:r>
+        <w:rPr>
+          <w:rFonts w:ascii="Times New Roman" w:hAnsi="Times New Roman" w:cs="Times New Roman"/>
+        </w:rPr>
+        <w:t xml:space="preserve">Figura </w:t>
+      </w:r>
+      <w:r>
+        <w:rPr>
+          <w:rFonts w:ascii="Times New Roman" w:hAnsi="Times New Roman" w:cs="Times New Roman"/>
+        </w:rPr>
+        <w:fldChar w:fldCharType="begin"/>
+      </w:r>
+      <w:r>
+        <w:rPr>
+          <w:rFonts w:ascii="Times New Roman" w:hAnsi="Times New Roman" w:cs="Times New Roman"/>
+        </w:rPr>
+        <w:instrText xml:space="preserve"> SEQ Figura \* ARABIC </w:instrText>
+      </w:r>
+      <w:r>
+        <w:rPr>
+          <w:rFonts w:ascii="Times New Roman" w:hAnsi="Times New Roman" w:cs="Times New Roman"/>
+        </w:rPr>
+        <w:fldChar w:fldCharType="separate"/>
+      </w:r>
+      <w:r>
+        <w:rPr>
+          <w:rFonts w:ascii="Times New Roman" w:hAnsi="Times New Roman" w:cs="Times New Roman"/>
+          <w:noProof/>
+        </w:rPr>
+        <w:t>32</w:t>
+      </w:r>
+      <w:r>
+        <w:rPr>
+          <w:rFonts w:ascii="Times New Roman" w:hAnsi="Times New Roman" w:cs="Times New Roman"/>
+        </w:rPr>
+        <w:fldChar w:fldCharType="end"/>
+      </w:r>
+      <w:r>
+        <w:rPr>
+          <w:rFonts w:ascii="Times New Roman" w:hAnsi="Times New Roman" w:cs="Times New Roman"/>
+        </w:rPr>
+        <w:t xml:space="preserve"> Módulo com classes e métodos</w:t>
+      </w:r>
+    </w:p>
+    <w:p>
+      <w:pPr>
+        <w:jc w:val="center"/>
+        <w:rPr>
+          <w:rFonts w:ascii="Times New Roman" w:hAnsi="Times New Roman" w:cs="Times New Roman"/>
+          <w:b/>
+          <w:bCs/>
+        </w:rPr>
+      </w:pPr>
+    </w:p>
+    <w:p>
+      <w:pPr>
+        <w:keepNext/>
+        <w:jc w:val="center"/>
+        <w:rPr>
+          <w:rFonts w:ascii="Times New Roman" w:hAnsi="Times New Roman" w:cs="Times New Roman"/>
+        </w:rPr>
+      </w:pPr>
+      <w:r>
+        <w:rPr>
+          <w:rFonts w:ascii="Times New Roman" w:hAnsi="Times New Roman" w:cs="Times New Roman"/>
+          <w:b/>
+          <w:bCs/>
+        </w:rPr>
+        <w:drawing>
+          <wp:inline distT="0" distB="0" distL="0" distR="0" wp14:anchorId="59652FE7" wp14:editId="56010993">
+            <wp:extent cx="5400040" cy="3588385"/>
+            <wp:effectExtent l="0" t="0" r="0" b="0"/>
+            <wp:docPr id="9" name="Imagem 9"/>
+            <wp:cNvGraphicFramePr>
+              <a:graphicFrameLocks xmlns:a="http://schemas.openxmlformats.org/drawingml/2006/main" noChangeAspect="1"/>
+            </wp:cNvGraphicFramePr>
+            <a:graphic xmlns:a="http://schemas.openxmlformats.org/drawingml/2006/main">
+              <a:graphicData uri="http://schemas.openxmlformats.org/drawingml/2006/picture">
+                <pic:pic xmlns:pic="http://schemas.openxmlformats.org/drawingml/2006/picture">
+                  <pic:nvPicPr>
+                    <pic:cNvPr id="1" name=""/>
+                    <pic:cNvPicPr/>
+                  </pic:nvPicPr>
+                  <pic:blipFill>
+                    <a:blip r:embed="rId37"/>
+                    <a:stretch>
+                      <a:fillRect/>
+                    </a:stretch>
+                  </pic:blipFill>
+                  <pic:spPr>
+                    <a:xfrm>
+                      <a:off x="0" y="0"/>
+                      <a:ext cx="5400040" cy="3588385"/>
+                    </a:xfrm>
+                    <a:prstGeom prst="rect">
+                      <a:avLst/>
+                    </a:prstGeom>
+                  </pic:spPr>
+                </pic:pic>
+              </a:graphicData>
+            </a:graphic>
+          </wp:inline>
+        </w:drawing>
+      </w:r>
+    </w:p>
+    <w:p>
+      <w:pPr>
+        <w:pStyle w:val="Legenda"/>
+        <w:jc w:val="center"/>
+        <w:rPr>
+          <w:rFonts w:ascii="Times New Roman" w:hAnsi="Times New Roman" w:cs="Times New Roman"/>
+        </w:rPr>
+      </w:pPr>
+      <w:r>
+        <w:rPr>
+          <w:rFonts w:ascii="Times New Roman" w:hAnsi="Times New Roman" w:cs="Times New Roman"/>
+        </w:rPr>
+        <w:t xml:space="preserve">Figura </w:t>
+      </w:r>
+      <w:r>
+        <w:rPr>
+          <w:rFonts w:ascii="Times New Roman" w:hAnsi="Times New Roman" w:cs="Times New Roman"/>
+        </w:rPr>
+        <w:fldChar w:fldCharType="begin"/>
+      </w:r>
+      <w:r>
+        <w:rPr>
+          <w:rFonts w:ascii="Times New Roman" w:hAnsi="Times New Roman" w:cs="Times New Roman"/>
+        </w:rPr>
+        <w:instrText xml:space="preserve"> SEQ Figura \* ARABIC </w:instrText>
+      </w:r>
+      <w:r>
+        <w:rPr>
+          <w:rFonts w:ascii="Times New Roman" w:hAnsi="Times New Roman" w:cs="Times New Roman"/>
+        </w:rPr>
+        <w:fldChar w:fldCharType="separate"/>
+      </w:r>
+      <w:r>
+        <w:rPr>
+          <w:rFonts w:ascii="Times New Roman" w:hAnsi="Times New Roman" w:cs="Times New Roman"/>
+          <w:noProof/>
+        </w:rPr>
+        <w:t>33</w:t>
+      </w:r>
+      <w:r>
+        <w:rPr>
+          <w:rFonts w:ascii="Times New Roman" w:hAnsi="Times New Roman" w:cs="Times New Roman"/>
+        </w:rPr>
+        <w:fldChar w:fldCharType="end"/>
+      </w:r>
+      <w:r>
+        <w:rPr>
+          <w:rFonts w:ascii="Times New Roman" w:hAnsi="Times New Roman" w:cs="Times New Roman"/>
+        </w:rPr>
+        <w:t xml:space="preserve"> </w:t>
+      </w:r>
+      <w:proofErr w:type="spellStart"/>
+      <w:r>
+        <w:rPr>
+          <w:rFonts w:ascii="Times New Roman" w:hAnsi="Times New Roman" w:cs="Times New Roman"/>
+        </w:rPr>
+        <w:t>Main</w:t>
+      </w:r>
+      <w:proofErr w:type="spellEnd"/>
+    </w:p>
+    <w:p>
+      <w:pPr>
+        <w:rPr>
+          <w:rFonts w:ascii="Times New Roman" w:hAnsi="Times New Roman" w:cs="Times New Roman"/>
+        </w:rPr>
+      </w:pPr>
+    </w:p>
+    <w:p>
+      <w:pPr>
+        <w:keepNext/>
+        <w:jc w:val="center"/>
+        <w:rPr>
+          <w:rFonts w:ascii="Times New Roman" w:hAnsi="Times New Roman" w:cs="Times New Roman"/>
+        </w:rPr>
+      </w:pPr>
+      <w:r>
+        <w:rPr>
+          <w:rFonts w:ascii="Times New Roman" w:hAnsi="Times New Roman" w:cs="Times New Roman"/>
+        </w:rPr>
+        <w:lastRenderedPageBreak/>
+        <w:drawing>
+          <wp:inline distT="0" distB="0" distL="0" distR="0" wp14:anchorId="45457849" wp14:editId="152461FD">
+            <wp:extent cx="3496163" cy="3029373"/>
+            <wp:effectExtent l="0" t="0" r="9525" b="0"/>
+            <wp:docPr id="35" name="Imagem 35"/>
+            <wp:cNvGraphicFramePr>
+              <a:graphicFrameLocks xmlns:a="http://schemas.openxmlformats.org/drawingml/2006/main" noChangeAspect="1"/>
+            </wp:cNvGraphicFramePr>
+            <a:graphic xmlns:a="http://schemas.openxmlformats.org/drawingml/2006/main">
+              <a:graphicData uri="http://schemas.openxmlformats.org/drawingml/2006/picture">
+                <pic:pic xmlns:pic="http://schemas.openxmlformats.org/drawingml/2006/picture">
+                  <pic:nvPicPr>
+                    <pic:cNvPr id="1" name=""/>
+                    <pic:cNvPicPr/>
+                  </pic:nvPicPr>
+                  <pic:blipFill>
+                    <a:blip r:embed="rId38"/>
+                    <a:stretch>
+                      <a:fillRect/>
+                    </a:stretch>
+                  </pic:blipFill>
+                  <pic:spPr>
+                    <a:xfrm>
+                      <a:off x="0" y="0"/>
+                      <a:ext cx="3496163" cy="3029373"/>
+                    </a:xfrm>
+                    <a:prstGeom prst="rect">
+                      <a:avLst/>
+                    </a:prstGeom>
+                  </pic:spPr>
+                </pic:pic>
+              </a:graphicData>
+            </a:graphic>
+          </wp:inline>
+        </w:drawing>
+      </w:r>
+    </w:p>
+    <w:p>
+      <w:pPr>
+        <w:pStyle w:val="Legenda"/>
+        <w:jc w:val="center"/>
+        <w:rPr>
+          <w:rFonts w:ascii="Times New Roman" w:hAnsi="Times New Roman" w:cs="Times New Roman"/>
+        </w:rPr>
+      </w:pPr>
+      <w:r>
+        <w:rPr>
+          <w:rFonts w:ascii="Times New Roman" w:hAnsi="Times New Roman" w:cs="Times New Roman"/>
+        </w:rPr>
+        <w:t xml:space="preserve">Figura </w:t>
+      </w:r>
+      <w:r>
+        <w:rPr>
+          <w:rFonts w:ascii="Times New Roman" w:hAnsi="Times New Roman" w:cs="Times New Roman"/>
+        </w:rPr>
+        <w:fldChar w:fldCharType="begin"/>
+      </w:r>
+      <w:r>
+        <w:rPr>
+          <w:rFonts w:ascii="Times New Roman" w:hAnsi="Times New Roman" w:cs="Times New Roman"/>
+        </w:rPr>
+        <w:instrText xml:space="preserve"> SEQ Figura \* ARABIC </w:instrText>
+      </w:r>
+      <w:r>
+        <w:rPr>
+          <w:rFonts w:ascii="Times New Roman" w:hAnsi="Times New Roman" w:cs="Times New Roman"/>
+        </w:rPr>
+        <w:fldChar w:fldCharType="separate"/>
+      </w:r>
+      <w:r>
+        <w:rPr>
+          <w:rFonts w:ascii="Times New Roman" w:hAnsi="Times New Roman" w:cs="Times New Roman"/>
+          <w:noProof/>
+        </w:rPr>
+        <w:t>34</w:t>
+      </w:r>
+      <w:r>
+        <w:rPr>
+          <w:rFonts w:ascii="Times New Roman" w:hAnsi="Times New Roman" w:cs="Times New Roman"/>
+        </w:rPr>
+        <w:fldChar w:fldCharType="end"/>
+      </w:r>
+      <w:r>
+        <w:rPr>
+          <w:rFonts w:ascii="Times New Roman" w:hAnsi="Times New Roman" w:cs="Times New Roman"/>
+        </w:rPr>
+        <w:t xml:space="preserve"> Saída no terminal</w:t>
+      </w:r>
+    </w:p>
+    <w:p>
+      <w:pPr>
+        <w:rPr>
+          <w:rFonts w:ascii="Times New Roman" w:hAnsi="Times New Roman" w:cs="Times New Roman"/>
+        </w:rPr>
+      </w:pPr>
+    </w:p>
+    <w:p>
+      <w:pPr>
+        <w:rPr>
+          <w:rFonts w:ascii="Times New Roman" w:hAnsi="Times New Roman" w:cs="Times New Roman"/>
+        </w:rPr>
+      </w:pPr>
+    </w:p>
+    <w:p>
+      <w:pPr>
+        <w:rPr>
+          <w:rFonts w:ascii="Times New Roman" w:hAnsi="Times New Roman" w:cs="Times New Roman"/>
+        </w:rPr>
+      </w:pPr>
+    </w:p>
+    <w:p>
+      <w:pPr>
+        <w:jc w:val="center"/>
+        <w:rPr>
+          <w:rFonts w:ascii="Times New Roman" w:hAnsi="Times New Roman" w:cs="Times New Roman"/>
+          <w:b/>
+          <w:bCs/>
+        </w:rPr>
+      </w:pPr>
+      <w:r>
+        <w:rPr>
+          <w:rFonts w:ascii="Times New Roman" w:hAnsi="Times New Roman" w:cs="Times New Roman"/>
+          <w:b/>
+          <w:bCs/>
+        </w:rPr>
+        <w:t xml:space="preserve">Exercício </w:t>
+      </w:r>
+      <w:r>
+        <w:rPr>
+          <w:rFonts w:ascii="Times New Roman" w:hAnsi="Times New Roman" w:cs="Times New Roman"/>
+          <w:b/>
+          <w:bCs/>
+        </w:rPr>
+        <w:t>2</w:t>
+      </w:r>
+    </w:p>
+    <w:p>
+      <w:pPr>
+        <w:jc w:val="center"/>
+        <w:rPr>
+          <w:rFonts w:ascii="Times New Roman" w:hAnsi="Times New Roman" w:cs="Times New Roman"/>
+          <w:b/>
+          <w:bCs/>
+        </w:rPr>
+      </w:pPr>
+    </w:p>
+    <w:p>
+      <w:pPr>
+        <w:keepNext/>
+        <w:jc w:val="center"/>
+        <w:rPr>
+          <w:rFonts w:ascii="Times New Roman" w:hAnsi="Times New Roman" w:cs="Times New Roman"/>
+        </w:rPr>
+      </w:pPr>
+      <w:r>
+        <w:rPr>
+          <w:rFonts w:ascii="Times New Roman" w:hAnsi="Times New Roman" w:cs="Times New Roman"/>
+          <w:b/>
+          <w:bCs/>
+        </w:rPr>
+        <w:drawing>
+          <wp:inline distT="0" distB="0" distL="0" distR="0" wp14:anchorId="10AD05E2" wp14:editId="58BA2D10">
+            <wp:extent cx="5400040" cy="4213225"/>
+            <wp:effectExtent l="0" t="0" r="0" b="0"/>
+            <wp:docPr id="39" name="Imagem 39"/>
+            <wp:cNvGraphicFramePr>
+              <a:graphicFrameLocks xmlns:a="http://schemas.openxmlformats.org/drawingml/2006/main" noChangeAspect="1"/>
+            </wp:cNvGraphicFramePr>
+            <a:graphic xmlns:a="http://schemas.openxmlformats.org/drawingml/2006/main">
+              <a:graphicData uri="http://schemas.openxmlformats.org/drawingml/2006/picture">
+                <pic:pic xmlns:pic="http://schemas.openxmlformats.org/drawingml/2006/picture">
+                  <pic:nvPicPr>
+                    <pic:cNvPr id="1" name=""/>
+                    <pic:cNvPicPr/>
+                  </pic:nvPicPr>
+                  <pic:blipFill>
+                    <a:blip r:embed="rId39"/>
+                    <a:stretch>
+                      <a:fillRect/>
+                    </a:stretch>
+                  </pic:blipFill>
+                  <pic:spPr>
+                    <a:xfrm>
+                      <a:off x="0" y="0"/>
+                      <a:ext cx="5400040" cy="4213225"/>
+                    </a:xfrm>
+                    <a:prstGeom prst="rect">
+                      <a:avLst/>
+                    </a:prstGeom>
+                  </pic:spPr>
+                </pic:pic>
+              </a:graphicData>
+            </a:graphic>
+          </wp:inline>
+        </w:drawing>
+      </w:r>
+    </w:p>
+    <w:p>
+      <w:pPr>
+        <w:pStyle w:val="Legenda"/>
+        <w:jc w:val="center"/>
+        <w:rPr>
+          <w:rFonts w:ascii="Times New Roman" w:hAnsi="Times New Roman" w:cs="Times New Roman"/>
+          <w:b/>
+          <w:bCs/>
+        </w:rPr>
+      </w:pPr>
+      <w:r>
+        <w:rPr>
+          <w:rFonts w:ascii="Times New Roman" w:hAnsi="Times New Roman" w:cs="Times New Roman"/>
+        </w:rPr>
+        <w:t xml:space="preserve">Figura </w:t>
+      </w:r>
+      <w:r>
+        <w:rPr>
+          <w:rFonts w:ascii="Times New Roman" w:hAnsi="Times New Roman" w:cs="Times New Roman"/>
+        </w:rPr>
+        <w:fldChar w:fldCharType="begin"/>
+      </w:r>
+      <w:r>
+        <w:rPr>
+          <w:rFonts w:ascii="Times New Roman" w:hAnsi="Times New Roman" w:cs="Times New Roman"/>
+        </w:rPr>
+        <w:instrText xml:space="preserve"> SEQ Figura \* ARABIC </w:instrText>
+      </w:r>
+      <w:r>
+        <w:rPr>
+          <w:rFonts w:ascii="Times New Roman" w:hAnsi="Times New Roman" w:cs="Times New Roman"/>
+        </w:rPr>
+        <w:fldChar w:fldCharType="separate"/>
+      </w:r>
+      <w:r>
+        <w:rPr>
+          <w:rFonts w:ascii="Times New Roman" w:hAnsi="Times New Roman" w:cs="Times New Roman"/>
+          <w:noProof/>
+        </w:rPr>
+        <w:t>35</w:t>
+      </w:r>
+      <w:r>
+        <w:rPr>
+          <w:rFonts w:ascii="Times New Roman" w:hAnsi="Times New Roman" w:cs="Times New Roman"/>
+        </w:rPr>
+        <w:fldChar w:fldCharType="end"/>
+      </w:r>
+      <w:r>
+        <w:rPr>
+          <w:rFonts w:ascii="Times New Roman" w:hAnsi="Times New Roman" w:cs="Times New Roman"/>
+        </w:rPr>
+        <w:t xml:space="preserve"> Módulo com classes e métodos</w:t>
+      </w:r>
+    </w:p>
+    <w:p>
+      <w:pPr>
+        <w:jc w:val="center"/>
+        <w:rPr>
+          <w:rFonts w:ascii="Times New Roman" w:hAnsi="Times New Roman" w:cs="Times New Roman"/>
+        </w:rPr>
+      </w:pPr>
+    </w:p>
+    <w:p>
+      <w:pPr>
+        <w:keepNext/>
+        <w:jc w:val="center"/>
+        <w:rPr>
+          <w:rFonts w:ascii="Times New Roman" w:hAnsi="Times New Roman" w:cs="Times New Roman"/>
+        </w:rPr>
+      </w:pPr>
+      <w:r>
+        <w:rPr>
+          <w:rFonts w:ascii="Times New Roman" w:hAnsi="Times New Roman" w:cs="Times New Roman"/>
+        </w:rPr>
+        <w:lastRenderedPageBreak/>
+        <w:drawing>
+          <wp:inline distT="0" distB="0" distL="0" distR="0" wp14:anchorId="045219E3" wp14:editId="35649136">
+            <wp:extent cx="5400040" cy="1784350"/>
+            <wp:effectExtent l="0" t="0" r="0" b="6350"/>
+            <wp:docPr id="38" name="Imagem 38"/>
+            <wp:cNvGraphicFramePr>
+              <a:graphicFrameLocks xmlns:a="http://schemas.openxmlformats.org/drawingml/2006/main" noChangeAspect="1"/>
+            </wp:cNvGraphicFramePr>
+            <a:graphic xmlns:a="http://schemas.openxmlformats.org/drawingml/2006/main">
+              <a:graphicData uri="http://schemas.openxmlformats.org/drawingml/2006/picture">
+                <pic:pic xmlns:pic="http://schemas.openxmlformats.org/drawingml/2006/picture">
+                  <pic:nvPicPr>
+                    <pic:cNvPr id="1" name=""/>
+                    <pic:cNvPicPr/>
+                  </pic:nvPicPr>
+                  <pic:blipFill>
+                    <a:blip r:embed="rId40"/>
+                    <a:stretch>
+                      <a:fillRect/>
+                    </a:stretch>
+                  </pic:blipFill>
+                  <pic:spPr>
+                    <a:xfrm>
+                      <a:off x="0" y="0"/>
+                      <a:ext cx="5400040" cy="1784350"/>
+                    </a:xfrm>
+                    <a:prstGeom prst="rect">
+                      <a:avLst/>
+                    </a:prstGeom>
+                  </pic:spPr>
+                </pic:pic>
+              </a:graphicData>
+            </a:graphic>
+          </wp:inline>
+        </w:drawing>
+      </w:r>
+    </w:p>
+    <w:p>
+      <w:pPr>
+        <w:pStyle w:val="Legenda"/>
+        <w:jc w:val="center"/>
+        <w:rPr>
+          <w:rFonts w:ascii="Times New Roman" w:hAnsi="Times New Roman" w:cs="Times New Roman"/>
+        </w:rPr>
+      </w:pPr>
+      <w:r>
+        <w:rPr>
+          <w:rFonts w:ascii="Times New Roman" w:hAnsi="Times New Roman" w:cs="Times New Roman"/>
+        </w:rPr>
+        <w:t xml:space="preserve">Figura </w:t>
+      </w:r>
+      <w:r>
+        <w:rPr>
+          <w:rFonts w:ascii="Times New Roman" w:hAnsi="Times New Roman" w:cs="Times New Roman"/>
+        </w:rPr>
+        <w:fldChar w:fldCharType="begin"/>
+      </w:r>
+      <w:r>
+        <w:rPr>
+          <w:rFonts w:ascii="Times New Roman" w:hAnsi="Times New Roman" w:cs="Times New Roman"/>
+        </w:rPr>
+        <w:instrText xml:space="preserve"> SEQ Figura \* ARABIC </w:instrText>
+      </w:r>
+      <w:r>
+        <w:rPr>
+          <w:rFonts w:ascii="Times New Roman" w:hAnsi="Times New Roman" w:cs="Times New Roman"/>
+        </w:rPr>
+        <w:fldChar w:fldCharType="separate"/>
+      </w:r>
+      <w:r>
+        <w:rPr>
+          <w:rFonts w:ascii="Times New Roman" w:hAnsi="Times New Roman" w:cs="Times New Roman"/>
+          <w:noProof/>
+        </w:rPr>
+        <w:t>36</w:t>
+      </w:r>
+      <w:r>
+        <w:rPr>
+          <w:rFonts w:ascii="Times New Roman" w:hAnsi="Times New Roman" w:cs="Times New Roman"/>
+        </w:rPr>
+        <w:fldChar w:fldCharType="end"/>
+      </w:r>
+      <w:r>
+        <w:rPr>
+          <w:rFonts w:ascii="Times New Roman" w:hAnsi="Times New Roman" w:cs="Times New Roman"/>
+        </w:rPr>
+        <w:t xml:space="preserve"> </w:t>
+      </w:r>
+      <w:proofErr w:type="spellStart"/>
+      <w:r>
+        <w:rPr>
+          <w:rFonts w:ascii="Times New Roman" w:hAnsi="Times New Roman" w:cs="Times New Roman"/>
+        </w:rPr>
+        <w:t>Main</w:t>
+      </w:r>
+      <w:proofErr w:type="spellEnd"/>
+    </w:p>
+    <w:p>
+      <w:pPr>
+        <w:jc w:val="center"/>
+        <w:rPr>
+          <w:rFonts w:ascii="Times New Roman" w:hAnsi="Times New Roman" w:cs="Times New Roman"/>
+        </w:rPr>
+      </w:pPr>
+    </w:p>
+    <w:p>
+      <w:pPr>
+        <w:keepNext/>
+        <w:rPr>
+          <w:rFonts w:ascii="Times New Roman" w:hAnsi="Times New Roman" w:cs="Times New Roman"/>
+        </w:rPr>
+      </w:pPr>
+      <w:r>
+        <w:rPr>
+          <w:rFonts w:ascii="Times New Roman" w:hAnsi="Times New Roman" w:cs="Times New Roman"/>
+        </w:rPr>
+        <w:drawing>
+          <wp:inline distT="0" distB="0" distL="0" distR="0" wp14:anchorId="08E43B0A" wp14:editId="580FBD48">
+            <wp:extent cx="5400040" cy="1845945"/>
+            <wp:effectExtent l="0" t="0" r="0" b="1905"/>
+            <wp:docPr id="37" name="Imagem 37"/>
+            <wp:cNvGraphicFramePr>
+              <a:graphicFrameLocks xmlns:a="http://schemas.openxmlformats.org/drawingml/2006/main" noChangeAspect="1"/>
+            </wp:cNvGraphicFramePr>
+            <a:graphic xmlns:a="http://schemas.openxmlformats.org/drawingml/2006/main">
+              <a:graphicData uri="http://schemas.openxmlformats.org/drawingml/2006/picture">
+                <pic:pic xmlns:pic="http://schemas.openxmlformats.org/drawingml/2006/picture">
+                  <pic:nvPicPr>
+                    <pic:cNvPr id="1" name=""/>
+                    <pic:cNvPicPr/>
+                  </pic:nvPicPr>
+                  <pic:blipFill>
+                    <a:blip r:embed="rId41"/>
+                    <a:stretch>
+                      <a:fillRect/>
+                    </a:stretch>
+                  </pic:blipFill>
+                  <pic:spPr>
+                    <a:xfrm>
+                      <a:off x="0" y="0"/>
+                      <a:ext cx="5400040" cy="1845945"/>
+                    </a:xfrm>
+                    <a:prstGeom prst="rect">
+                      <a:avLst/>
+                    </a:prstGeom>
+                  </pic:spPr>
+                </pic:pic>
+              </a:graphicData>
+            </a:graphic>
+          </wp:inline>
+        </w:drawing>
+      </w:r>
+    </w:p>
+    <w:p>
+      <w:pPr>
+        <w:pStyle w:val="Legenda"/>
+        <w:jc w:val="center"/>
+        <w:rPr>
+          <w:rFonts w:ascii="Times New Roman" w:hAnsi="Times New Roman" w:cs="Times New Roman"/>
+        </w:rPr>
+      </w:pPr>
+      <w:r>
+        <w:rPr>
+          <w:rFonts w:ascii="Times New Roman" w:hAnsi="Times New Roman" w:cs="Times New Roman"/>
+        </w:rPr>
+        <w:t xml:space="preserve">Figura </w:t>
+      </w:r>
+      <w:r>
+        <w:rPr>
+          <w:rFonts w:ascii="Times New Roman" w:hAnsi="Times New Roman" w:cs="Times New Roman"/>
+        </w:rPr>
+        <w:fldChar w:fldCharType="begin"/>
+      </w:r>
+      <w:r>
+        <w:rPr>
+          <w:rFonts w:ascii="Times New Roman" w:hAnsi="Times New Roman" w:cs="Times New Roman"/>
+        </w:rPr>
+        <w:instrText xml:space="preserve"> SEQ Figura \* ARABIC </w:instrText>
+      </w:r>
+      <w:r>
+        <w:rPr>
+          <w:rFonts w:ascii="Times New Roman" w:hAnsi="Times New Roman" w:cs="Times New Roman"/>
+        </w:rPr>
+        <w:fldChar w:fldCharType="separate"/>
+      </w:r>
+      <w:r>
+        <w:rPr>
+          <w:rFonts w:ascii="Times New Roman" w:hAnsi="Times New Roman" w:cs="Times New Roman"/>
+          <w:noProof/>
+        </w:rPr>
+        <w:t>37</w:t>
+      </w:r>
+      <w:r>
+        <w:rPr>
+          <w:rFonts w:ascii="Times New Roman" w:hAnsi="Times New Roman" w:cs="Times New Roman"/>
+        </w:rPr>
+        <w:fldChar w:fldCharType="end"/>
+      </w:r>
+      <w:r>
+        <w:rPr>
+          <w:rFonts w:ascii="Times New Roman" w:hAnsi="Times New Roman" w:cs="Times New Roman"/>
+        </w:rPr>
+        <w:t xml:space="preserve"> Erro causado ao tentar criar uma entrega genérica</w:t>
+      </w:r>
+    </w:p>
+    <w:p>
+      <w:pPr>
+        <w:rPr>
+          <w:rFonts w:ascii="Times New Roman" w:hAnsi="Times New Roman" w:cs="Times New Roman"/>
+        </w:rPr>
+      </w:pPr>
+    </w:p>
+    <w:p>
+      <w:pPr>
+        <w:keepNext/>
+        <w:jc w:val="center"/>
+        <w:rPr>
+          <w:rFonts w:ascii="Times New Roman" w:hAnsi="Times New Roman" w:cs="Times New Roman"/>
+        </w:rPr>
+      </w:pPr>
+      <w:r>
+        <w:rPr>
+          <w:rFonts w:ascii="Times New Roman" w:hAnsi="Times New Roman" w:cs="Times New Roman"/>
+        </w:rPr>
+        <w:drawing>
+          <wp:inline distT="0" distB="0" distL="0" distR="0" wp14:anchorId="4CAE42D0" wp14:editId="5445FD14">
+            <wp:extent cx="3667637" cy="2295845"/>
+            <wp:effectExtent l="0" t="0" r="9525" b="9525"/>
+            <wp:docPr id="40" name="Imagem 40"/>
+            <wp:cNvGraphicFramePr>
+              <a:graphicFrameLocks xmlns:a="http://schemas.openxmlformats.org/drawingml/2006/main" noChangeAspect="1"/>
+            </wp:cNvGraphicFramePr>
+            <a:graphic xmlns:a="http://schemas.openxmlformats.org/drawingml/2006/main">
+              <a:graphicData uri="http://schemas.openxmlformats.org/drawingml/2006/picture">
+                <pic:pic xmlns:pic="http://schemas.openxmlformats.org/drawingml/2006/picture">
+                  <pic:nvPicPr>
+                    <pic:cNvPr id="1" name=""/>
+                    <pic:cNvPicPr/>
+                  </pic:nvPicPr>
+                  <pic:blipFill>
+                    <a:blip r:embed="rId42"/>
+                    <a:stretch>
+                      <a:fillRect/>
+                    </a:stretch>
+                  </pic:blipFill>
+                  <pic:spPr>
+                    <a:xfrm>
+                      <a:off x="0" y="0"/>
+                      <a:ext cx="3667637" cy="2295845"/>
+                    </a:xfrm>
+                    <a:prstGeom prst="rect">
+                      <a:avLst/>
+                    </a:prstGeom>
+                  </pic:spPr>
+                </pic:pic>
+              </a:graphicData>
+            </a:graphic>
+          </wp:inline>
+        </w:drawing>
+      </w:r>
+    </w:p>
+    <w:p>
+      <w:pPr>
+        <w:pStyle w:val="Legenda"/>
+        <w:jc w:val="center"/>
+        <w:rPr>
+          <w:rFonts w:ascii="Times New Roman" w:hAnsi="Times New Roman" w:cs="Times New Roman"/>
+        </w:rPr>
+      </w:pPr>
+      <w:r>
+        <w:rPr>
+          <w:rFonts w:ascii="Times New Roman" w:hAnsi="Times New Roman" w:cs="Times New Roman"/>
+        </w:rPr>
+        <w:t xml:space="preserve">Figura </w:t>
+      </w:r>
+      <w:r>
+        <w:rPr>
+          <w:rFonts w:ascii="Times New Roman" w:hAnsi="Times New Roman" w:cs="Times New Roman"/>
+        </w:rPr>
+        <w:fldChar w:fldCharType="begin"/>
+      </w:r>
+      <w:r>
+        <w:rPr>
+          <w:rFonts w:ascii="Times New Roman" w:hAnsi="Times New Roman" w:cs="Times New Roman"/>
+        </w:rPr>
+        <w:instrText xml:space="preserve"> SEQ Figura \* ARABIC </w:instrText>
+      </w:r>
+      <w:r>
+        <w:rPr>
+          <w:rFonts w:ascii="Times New Roman" w:hAnsi="Times New Roman" w:cs="Times New Roman"/>
+        </w:rPr>
+        <w:fldChar w:fldCharType="separate"/>
+      </w:r>
+      <w:r>
+        <w:rPr>
+          <w:rFonts w:ascii="Times New Roman" w:hAnsi="Times New Roman" w:cs="Times New Roman"/>
+          <w:noProof/>
+        </w:rPr>
+        <w:t>38</w:t>
+      </w:r>
+      <w:r>
+        <w:rPr>
+          <w:rFonts w:ascii="Times New Roman" w:hAnsi="Times New Roman" w:cs="Times New Roman"/>
+        </w:rPr>
+        <w:fldChar w:fldCharType="end"/>
+      </w:r>
+      <w:r>
+        <w:rPr>
+          <w:rFonts w:ascii="Times New Roman" w:hAnsi="Times New Roman" w:cs="Times New Roman"/>
+        </w:rPr>
+        <w:t xml:space="preserve"> Saída no terminal</w:t>
       </w:r>
     </w:p>
     <w:sectPr>
@@ -5253,7 +6765,7 @@
   <w:style w:type="paragraph" w:default="1" w:styleId="Normal">
     <w:name w:val="Normal"/>
     <w:qFormat/>
-    <w:rsid w:val="00E52FBA"/>
+    <w:rsid w:val="00E91C75"/>
   </w:style>
   <w:style w:type="character" w:default="1" w:styleId="Fontepargpadro">
     <w:name w:val="Default Paragraph Font"/>

</xml_diff>